<commit_message>
convert to gh pages
</commit_message>
<xml_diff>
--- a/cv/CV_tbp.docx
+++ b/cv/CV_tbp.docx
@@ -11,7 +11,7 @@
     </w:p>
     <w:tbl>
       <w:tblPr>
-        <w:tblStyle w:val="a"/>
+        <w:tblStyle w:val="1"/>
         <w:tblW w:w="10763" w:type="dxa"/>
         <w:tblLayout w:type="fixed"/>
         <w:tblLook w:val="0400" w:firstRow="0" w:lastRow="0" w:firstColumn="0" w:lastColumn="0" w:noHBand="0" w:noVBand="1"/>
@@ -181,7 +181,7 @@
           </mc:Choice>
           <mc:Fallback>
             <w:pict>
-              <v:shapetype w14:anchorId="26429B84" id="_x0000_t32" coordsize="21600,21600" o:spt="32" o:oned="t" path="m,l21600,21600e" filled="f">
+              <v:shapetype w14:anchorId="14536AC1" id="_x0000_t32" coordsize="21600,21600" o:spt="32" o:oned="t" path="m,l21600,21600e" filled="f">
                 <v:path arrowok="t" fillok="f" o:connecttype="none"/>
                 <o:lock v:ext="edit" shapetype="t"/>
               </v:shapetype>
@@ -812,11 +812,7 @@
           </mc:Choice>
           <mc:Fallback>
             <w:pict>
-              <v:shapetype w14:anchorId="5FF327CE" id="_x0000_t32" coordsize="21600,21600" o:spt="32" o:oned="t" path="m,l21600,21600e" filled="f">
-                <v:path arrowok="t" fillok="f" o:connecttype="none"/>
-                <o:lock v:ext="edit" shapetype="t"/>
-              </v:shapetype>
-              <v:shape id="Straight Arrow Connector 132314684" o:spid="_x0000_s1026" type="#_x0000_t32" style="position:absolute;margin-left:2pt;margin-top:13pt;width:532.5pt;height:1pt;z-index:251692032;visibility:visible;mso-wrap-style:square;mso-wrap-distance-left:9pt;mso-wrap-distance-top:0;mso-wrap-distance-right:9pt;mso-wrap-distance-bottom:0;mso-position-horizontal:absolute;mso-position-horizontal-relative:text;mso-position-vertical:absolute;mso-position-vertical-relative:text" o:gfxdata="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" strokecolor="black [3200]">
+              <v:shape w14:anchorId="7724AE22" id="Straight Arrow Connector 132314684" o:spid="_x0000_s1026" type="#_x0000_t32" style="position:absolute;margin-left:2pt;margin-top:13pt;width:532.5pt;height:1pt;z-index:251692032;visibility:visible;mso-wrap-style:square;mso-wrap-distance-left:9pt;mso-wrap-distance-top:0;mso-wrap-distance-right:9pt;mso-wrap-distance-bottom:0;mso-position-horizontal:absolute;mso-position-horizontal-relative:text;mso-position-vertical:absolute;mso-position-vertical-relative:text" o:gfxdata="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" strokecolor="black [3200]">
                 <v:stroke startarrowwidth="narrow" startarrowlength="short" endarrowwidth="narrow" endarrowlength="short" joinstyle="miter"/>
               </v:shape>
             </w:pict>
@@ -982,7 +978,900 @@
     <w:p>
       <w:pPr>
         <w:rPr>
-          <w:bCs/>
+          <w:b/>
+          <w:color w:val="auto"/>
+          <w:sz w:val="24"/>
+          <w:szCs w:val="24"/>
+        </w:rPr>
+      </w:pPr>
+    </w:p>
+    <w:p>
+      <w:pPr>
+        <w:rPr>
+          <w:b/>
+          <w:color w:val="auto"/>
+          <w:sz w:val="24"/>
+          <w:szCs w:val="24"/>
+        </w:rPr>
+      </w:pPr>
+      <w:r>
+        <w:rPr>
+          <w:b/>
+          <w:color w:val="auto"/>
+          <w:sz w:val="24"/>
+          <w:szCs w:val="24"/>
+        </w:rPr>
+        <w:t xml:space="preserve">TEACHING </w:t>
+      </w:r>
+      <w:r>
+        <w:rPr>
+          <w:b/>
+          <w:noProof/>
+          <w:color w:val="auto"/>
+          <w:sz w:val="24"/>
+          <w:szCs w:val="24"/>
+        </w:rPr>
+        <mc:AlternateContent>
+          <mc:Choice Requires="wps">
+            <w:drawing>
+              <wp:anchor distT="0" distB="0" distL="114300" distR="114300" simplePos="0" relativeHeight="251694080" behindDoc="0" locked="0" layoutInCell="1" hidden="0" allowOverlap="1" wp14:anchorId="1F2C07A3" wp14:editId="772DBA60">
+                <wp:simplePos x="0" y="0"/>
+                <wp:positionH relativeFrom="column">
+                  <wp:posOffset>1</wp:posOffset>
+                </wp:positionH>
+                <wp:positionV relativeFrom="paragraph">
+                  <wp:posOffset>165100</wp:posOffset>
+                </wp:positionV>
+                <wp:extent cx="6762750" cy="12700"/>
+                <wp:effectExtent l="0" t="0" r="0" b="0"/>
+                <wp:wrapNone/>
+                <wp:docPr id="8" name="Straight Arrow Connector 8"/>
+                <wp:cNvGraphicFramePr/>
+                <a:graphic xmlns:a="http://schemas.openxmlformats.org/drawingml/2006/main">
+                  <a:graphicData uri="http://schemas.microsoft.com/office/word/2010/wordprocessingShape">
+                    <wps:wsp>
+                      <wps:cNvCnPr/>
+                      <wps:spPr>
+                        <a:xfrm>
+                          <a:off x="1964625" y="3780000"/>
+                          <a:ext cx="6762750" cy="0"/>
+                        </a:xfrm>
+                        <a:prstGeom prst="straightConnector1">
+                          <a:avLst/>
+                        </a:prstGeom>
+                        <a:noFill/>
+                        <a:ln w="9525" cap="flat" cmpd="sng">
+                          <a:solidFill>
+                            <a:schemeClr val="dk1"/>
+                          </a:solidFill>
+                          <a:prstDash val="solid"/>
+                          <a:miter lim="800000"/>
+                          <a:headEnd type="none" w="sm" len="sm"/>
+                          <a:tailEnd type="none" w="sm" len="sm"/>
+                        </a:ln>
+                      </wps:spPr>
+                      <wps:bodyPr/>
+                    </wps:wsp>
+                  </a:graphicData>
+                </a:graphic>
+              </wp:anchor>
+            </w:drawing>
+          </mc:Choice>
+          <mc:Fallback>
+            <w:pict>
+              <v:shape w14:anchorId="376DCFA3" id="Straight Arrow Connector 8" o:spid="_x0000_s1026" type="#_x0000_t32" style="position:absolute;margin-left:0;margin-top:13pt;width:532.5pt;height:1pt;z-index:251694080;visibility:visible;mso-wrap-style:square;mso-wrap-distance-left:9pt;mso-wrap-distance-top:0;mso-wrap-distance-right:9pt;mso-wrap-distance-bottom:0;mso-position-horizontal:absolute;mso-position-horizontal-relative:text;mso-position-vertical:absolute;mso-position-vertical-relative:text" o:gfxdata="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" strokecolor="black [3200]">
+                <v:stroke startarrowwidth="narrow" startarrowlength="short" endarrowwidth="narrow" endarrowlength="short" joinstyle="miter"/>
+              </v:shape>
+            </w:pict>
+          </mc:Fallback>
+        </mc:AlternateContent>
+      </w:r>
+      <w:r>
+        <w:rPr>
+          <w:b/>
+          <w:color w:val="auto"/>
+          <w:sz w:val="24"/>
+          <w:szCs w:val="24"/>
+        </w:rPr>
+        <w:t xml:space="preserve"> AND MENTORING</w:t>
+      </w:r>
+    </w:p>
+    <w:p>
+      <w:pPr>
+        <w:rPr>
+          <w:bCs/>
+          <w:color w:val="auto"/>
+          <w:sz w:val="24"/>
+          <w:szCs w:val="24"/>
+          <w:u w:val="single"/>
+        </w:rPr>
+      </w:pPr>
+      <w:r>
+        <w:rPr>
+          <w:bCs/>
+          <w:color w:val="auto"/>
+          <w:sz w:val="24"/>
+          <w:szCs w:val="24"/>
+          <w:u w:val="single"/>
+        </w:rPr>
+        <w:t>Teaching</w:t>
+      </w:r>
+    </w:p>
+    <w:p>
+      <w:pPr>
+        <w:rPr>
+          <w:bCs/>
+          <w:color w:val="auto"/>
+          <w:sz w:val="24"/>
+          <w:szCs w:val="24"/>
+        </w:rPr>
+      </w:pPr>
+      <w:r>
+        <w:rPr>
+          <w:bCs/>
+          <w:color w:val="auto"/>
+          <w:sz w:val="24"/>
+          <w:szCs w:val="24"/>
+        </w:rPr>
+        <w:t>2025</w:t>
+      </w:r>
+      <w:r>
+        <w:rPr>
+          <w:bCs/>
+          <w:color w:val="auto"/>
+          <w:sz w:val="24"/>
+          <w:szCs w:val="24"/>
+        </w:rPr>
+        <w:tab/>
+      </w:r>
+      <w:r>
+        <w:rPr>
+          <w:bCs/>
+          <w:color w:val="auto"/>
+          <w:sz w:val="24"/>
+          <w:szCs w:val="24"/>
+        </w:rPr>
+        <w:tab/>
+        <w:t>Teaching assistant. The Policy Process, UC Davis.</w:t>
+      </w:r>
+    </w:p>
+    <w:p>
+      <w:pPr>
+        <w:rPr>
+          <w:bCs/>
+          <w:color w:val="auto"/>
+          <w:sz w:val="24"/>
+          <w:szCs w:val="24"/>
+        </w:rPr>
+      </w:pPr>
+      <w:r>
+        <w:rPr>
+          <w:bCs/>
+          <w:color w:val="auto"/>
+          <w:sz w:val="24"/>
+          <w:szCs w:val="24"/>
+        </w:rPr>
+        <w:t>2025</w:t>
+      </w:r>
+      <w:r>
+        <w:rPr>
+          <w:bCs/>
+          <w:color w:val="auto"/>
+          <w:sz w:val="24"/>
+          <w:szCs w:val="24"/>
+        </w:rPr>
+        <w:tab/>
+      </w:r>
+      <w:r>
+        <w:rPr>
+          <w:bCs/>
+          <w:color w:val="auto"/>
+          <w:sz w:val="24"/>
+          <w:szCs w:val="24"/>
+        </w:rPr>
+        <w:tab/>
+        <w:t>Teaching assistant. Environmental Governance, UC Davis.</w:t>
+      </w:r>
+    </w:p>
+    <w:p>
+      <w:pPr>
+        <w:rPr>
+          <w:bCs/>
+          <w:color w:val="auto"/>
+          <w:sz w:val="24"/>
+          <w:szCs w:val="24"/>
+        </w:rPr>
+      </w:pPr>
+      <w:r>
+        <w:rPr>
+          <w:bCs/>
+          <w:color w:val="auto"/>
+          <w:sz w:val="24"/>
+          <w:szCs w:val="24"/>
+        </w:rPr>
+        <w:t>2022, 2024</w:t>
+      </w:r>
+      <w:r>
+        <w:rPr>
+          <w:bCs/>
+          <w:color w:val="auto"/>
+          <w:sz w:val="24"/>
+          <w:szCs w:val="24"/>
+        </w:rPr>
+        <w:tab/>
+        <w:t>Instructor. R</w:t>
+      </w:r>
+      <w:r>
+        <w:rPr>
+          <w:bCs/>
+          <w:color w:val="auto"/>
+          <w:sz w:val="24"/>
+          <w:szCs w:val="24"/>
+        </w:rPr>
+        <w:t xml:space="preserve"> Data Analysis and Visualization (R-DAVIS)</w:t>
+      </w:r>
+      <w:r>
+        <w:rPr>
+          <w:bCs/>
+          <w:color w:val="auto"/>
+          <w:sz w:val="24"/>
+          <w:szCs w:val="24"/>
+        </w:rPr>
+        <w:t>, UC Davis</w:t>
+      </w:r>
+    </w:p>
+    <w:p>
+      <w:pPr>
+        <w:rPr>
+          <w:bCs/>
+          <w:color w:val="auto"/>
+          <w:sz w:val="24"/>
+          <w:szCs w:val="24"/>
+        </w:rPr>
+      </w:pPr>
+      <w:r>
+        <w:rPr>
+          <w:bCs/>
+          <w:color w:val="auto"/>
+          <w:sz w:val="24"/>
+          <w:szCs w:val="24"/>
+        </w:rPr>
+        <w:t xml:space="preserve">2021 </w:t>
+      </w:r>
+      <w:r>
+        <w:rPr>
+          <w:bCs/>
+          <w:color w:val="auto"/>
+          <w:sz w:val="24"/>
+          <w:szCs w:val="24"/>
+        </w:rPr>
+        <w:tab/>
+      </w:r>
+      <w:r>
+        <w:rPr>
+          <w:bCs/>
+          <w:color w:val="auto"/>
+          <w:sz w:val="24"/>
+          <w:szCs w:val="24"/>
+        </w:rPr>
+        <w:tab/>
+      </w:r>
+      <w:r>
+        <w:rPr>
+          <w:bCs/>
+          <w:color w:val="auto"/>
+          <w:sz w:val="24"/>
+          <w:szCs w:val="24"/>
+        </w:rPr>
+        <w:t>Grader</w:t>
+      </w:r>
+      <w:r>
+        <w:rPr>
+          <w:bCs/>
+          <w:color w:val="auto"/>
+          <w:sz w:val="24"/>
+          <w:szCs w:val="24"/>
+        </w:rPr>
+        <w:t>. Public Land</w:t>
+      </w:r>
+      <w:r>
+        <w:rPr>
+          <w:bCs/>
+          <w:color w:val="auto"/>
+          <w:sz w:val="24"/>
+          <w:szCs w:val="24"/>
+        </w:rPr>
+        <w:t>s</w:t>
+      </w:r>
+      <w:r>
+        <w:rPr>
+          <w:bCs/>
+          <w:color w:val="auto"/>
+          <w:sz w:val="24"/>
+          <w:szCs w:val="24"/>
+        </w:rPr>
+        <w:t xml:space="preserve"> Governance, UC Davis. </w:t>
+      </w:r>
+    </w:p>
+    <w:p>
+      <w:pPr>
+        <w:rPr>
+          <w:bCs/>
+          <w:color w:val="auto"/>
+          <w:sz w:val="24"/>
+          <w:szCs w:val="24"/>
+        </w:rPr>
+      </w:pPr>
+    </w:p>
+    <w:p>
+      <w:pPr>
+        <w:rPr>
+          <w:bCs/>
+          <w:color w:val="auto"/>
+          <w:sz w:val="24"/>
+          <w:szCs w:val="24"/>
+          <w:u w:val="single"/>
+        </w:rPr>
+      </w:pPr>
+      <w:r>
+        <w:rPr>
+          <w:bCs/>
+          <w:color w:val="auto"/>
+          <w:sz w:val="24"/>
+          <w:szCs w:val="24"/>
+          <w:u w:val="single"/>
+        </w:rPr>
+        <w:t>Guest Lecture</w:t>
+      </w:r>
+    </w:p>
+    <w:p>
+      <w:pPr>
+        <w:ind w:left="1440" w:hanging="1440"/>
+        <w:rPr>
+          <w:bCs/>
+          <w:color w:val="auto"/>
+          <w:sz w:val="24"/>
+          <w:szCs w:val="24"/>
+        </w:rPr>
+      </w:pPr>
+      <w:r>
+        <w:rPr>
+          <w:bCs/>
+          <w:color w:val="auto"/>
+          <w:sz w:val="24"/>
+          <w:szCs w:val="24"/>
+        </w:rPr>
+        <w:t>2025</w:t>
+      </w:r>
+      <w:r>
+        <w:rPr>
+          <w:bCs/>
+          <w:color w:val="auto"/>
+          <w:sz w:val="24"/>
+          <w:szCs w:val="24"/>
+        </w:rPr>
+        <w:tab/>
+        <w:t>Lecture titled “Polycentric Governance.” Guest lecture for a class on Sustainability of Socio-Ecological Systems at University of Denver (Denver, CO).</w:t>
+      </w:r>
+    </w:p>
+    <w:p>
+      <w:pPr>
+        <w:rPr>
+          <w:bCs/>
+          <w:color w:val="auto"/>
+          <w:sz w:val="24"/>
+          <w:szCs w:val="24"/>
+        </w:rPr>
+      </w:pPr>
+      <w:r>
+        <w:rPr>
+          <w:bCs/>
+          <w:color w:val="auto"/>
+          <w:sz w:val="24"/>
+          <w:szCs w:val="24"/>
+        </w:rPr>
+        <w:t xml:space="preserve">2024 </w:t>
+      </w:r>
+      <w:r>
+        <w:rPr>
+          <w:bCs/>
+          <w:color w:val="auto"/>
+          <w:sz w:val="24"/>
+          <w:szCs w:val="24"/>
+        </w:rPr>
+        <w:tab/>
+      </w:r>
+      <w:r>
+        <w:rPr>
+          <w:bCs/>
+          <w:color w:val="auto"/>
+          <w:sz w:val="24"/>
+          <w:szCs w:val="24"/>
+        </w:rPr>
+        <w:tab/>
+        <w:t>Lecture titled “</w:t>
+      </w:r>
+      <w:r>
+        <w:rPr>
+          <w:color w:val="auto"/>
+          <w:sz w:val="24"/>
+          <w:szCs w:val="24"/>
+        </w:rPr>
+        <w:t>Collaboration and Equity in Environmental Governance and Policy.”</w:t>
+      </w:r>
+    </w:p>
+    <w:p>
+      <w:pPr>
+        <w:ind w:left="2160" w:hanging="720"/>
+        <w:rPr>
+          <w:bCs/>
+          <w:color w:val="auto"/>
+          <w:sz w:val="24"/>
+          <w:szCs w:val="24"/>
+        </w:rPr>
+      </w:pPr>
+      <w:r>
+        <w:rPr>
+          <w:bCs/>
+          <w:color w:val="auto"/>
+          <w:sz w:val="24"/>
+          <w:szCs w:val="24"/>
+        </w:rPr>
+        <w:t>Guest lecture for a class on Principles of Ecology at American River College (Sacramento, CA)</w:t>
+      </w:r>
+      <w:r>
+        <w:rPr>
+          <w:bCs/>
+          <w:color w:val="auto"/>
+          <w:sz w:val="24"/>
+          <w:szCs w:val="24"/>
+        </w:rPr>
+        <w:t>.</w:t>
+      </w:r>
+    </w:p>
+    <w:p>
+      <w:pPr>
+        <w:rPr>
+          <w:bCs/>
+          <w:color w:val="auto"/>
+          <w:sz w:val="24"/>
+          <w:szCs w:val="24"/>
+        </w:rPr>
+      </w:pPr>
+      <w:r>
+        <w:rPr>
+          <w:bCs/>
+          <w:color w:val="auto"/>
+          <w:sz w:val="24"/>
+          <w:szCs w:val="24"/>
+        </w:rPr>
+        <w:t>2023</w:t>
+      </w:r>
+      <w:r>
+        <w:rPr>
+          <w:bCs/>
+          <w:color w:val="auto"/>
+          <w:sz w:val="24"/>
+          <w:szCs w:val="24"/>
+        </w:rPr>
+        <w:tab/>
+      </w:r>
+      <w:r>
+        <w:rPr>
+          <w:bCs/>
+          <w:color w:val="auto"/>
+          <w:sz w:val="24"/>
+          <w:szCs w:val="24"/>
+        </w:rPr>
+        <w:tab/>
+        <w:t>Lecture titled “Power and Equity in Environmental Governance: A Case Study in the California</w:t>
+      </w:r>
+    </w:p>
+    <w:p>
+      <w:pPr>
+        <w:ind w:left="2160" w:hanging="720"/>
+        <w:rPr>
+          <w:bCs/>
+          <w:color w:val="auto"/>
+          <w:sz w:val="24"/>
+          <w:szCs w:val="24"/>
+        </w:rPr>
+      </w:pPr>
+      <w:r>
+        <w:rPr>
+          <w:bCs/>
+          <w:color w:val="auto"/>
+          <w:sz w:val="24"/>
+          <w:szCs w:val="24"/>
+        </w:rPr>
+        <w:t>Delta.” Guest lecture for a class on EJ and Resilience at BOKU University (Vienna, Austria).</w:t>
+      </w:r>
+    </w:p>
+    <w:p>
+      <w:pPr>
+        <w:rPr>
+          <w:bCs/>
+          <w:color w:val="auto"/>
+          <w:sz w:val="24"/>
+          <w:szCs w:val="24"/>
+        </w:rPr>
+      </w:pPr>
+    </w:p>
+    <w:p>
+      <w:pPr>
+        <w:rPr>
+          <w:bCs/>
+          <w:color w:val="auto"/>
+          <w:sz w:val="24"/>
+          <w:szCs w:val="24"/>
+          <w:u w:val="single"/>
+        </w:rPr>
+      </w:pPr>
+      <w:r>
+        <w:rPr>
+          <w:bCs/>
+          <w:color w:val="auto"/>
+          <w:sz w:val="24"/>
+          <w:szCs w:val="24"/>
+          <w:u w:val="single"/>
+        </w:rPr>
+        <w:t>Undergraduate Interns</w:t>
+      </w:r>
+    </w:p>
+    <w:p>
+      <w:pPr>
+        <w:rPr>
+          <w:bCs/>
+          <w:color w:val="auto"/>
+          <w:sz w:val="24"/>
+          <w:szCs w:val="24"/>
+        </w:rPr>
+      </w:pPr>
+      <w:r>
+        <w:rPr>
+          <w:bCs/>
+          <w:color w:val="auto"/>
+          <w:sz w:val="24"/>
+          <w:szCs w:val="24"/>
+        </w:rPr>
+        <w:t xml:space="preserve">2024 - 2025 </w:t>
+      </w:r>
+      <w:r>
+        <w:rPr>
+          <w:bCs/>
+          <w:color w:val="auto"/>
+          <w:sz w:val="24"/>
+          <w:szCs w:val="24"/>
+        </w:rPr>
+        <w:tab/>
+        <w:t xml:space="preserve">Isabella Gonzales (BS </w:t>
+      </w:r>
+      <w:r>
+        <w:rPr>
+          <w:bCs/>
+          <w:color w:val="auto"/>
+          <w:sz w:val="24"/>
+          <w:szCs w:val="24"/>
+        </w:rPr>
+        <w:t>Environmental Science and Policy</w:t>
+      </w:r>
+      <w:r>
+        <w:rPr>
+          <w:bCs/>
+          <w:color w:val="auto"/>
+          <w:sz w:val="24"/>
+          <w:szCs w:val="24"/>
+        </w:rPr>
+        <w:t xml:space="preserve"> 2025)</w:t>
+      </w:r>
+    </w:p>
+    <w:p>
+      <w:pPr>
+        <w:rPr>
+          <w:bCs/>
+          <w:color w:val="auto"/>
+          <w:sz w:val="24"/>
+          <w:szCs w:val="24"/>
+        </w:rPr>
+      </w:pPr>
+      <w:r>
+        <w:rPr>
+          <w:bCs/>
+          <w:color w:val="auto"/>
+          <w:sz w:val="24"/>
+          <w:szCs w:val="24"/>
+        </w:rPr>
+        <w:t xml:space="preserve">2024 - 2025 </w:t>
+      </w:r>
+      <w:r>
+        <w:rPr>
+          <w:bCs/>
+          <w:color w:val="auto"/>
+          <w:sz w:val="24"/>
+          <w:szCs w:val="24"/>
+        </w:rPr>
+        <w:tab/>
+        <w:t xml:space="preserve">Nicholas Dunagan (BS </w:t>
+      </w:r>
+      <w:r>
+        <w:rPr>
+          <w:bCs/>
+          <w:color w:val="auto"/>
+          <w:sz w:val="24"/>
+          <w:szCs w:val="24"/>
+        </w:rPr>
+        <w:t>Environmental Science and Policy</w:t>
+      </w:r>
+      <w:r>
+        <w:rPr>
+          <w:bCs/>
+          <w:color w:val="auto"/>
+          <w:sz w:val="24"/>
+          <w:szCs w:val="24"/>
+        </w:rPr>
+        <w:t xml:space="preserve"> 2025)</w:t>
+      </w:r>
+    </w:p>
+    <w:p>
+      <w:pPr>
+        <w:rPr>
+          <w:bCs/>
+          <w:color w:val="auto"/>
+          <w:sz w:val="24"/>
+          <w:szCs w:val="24"/>
+        </w:rPr>
+      </w:pPr>
+      <w:r>
+        <w:rPr>
+          <w:bCs/>
+          <w:color w:val="auto"/>
+          <w:sz w:val="24"/>
+          <w:szCs w:val="24"/>
+        </w:rPr>
+        <w:t>2024</w:t>
+      </w:r>
+      <w:r>
+        <w:rPr>
+          <w:bCs/>
+          <w:color w:val="auto"/>
+          <w:sz w:val="24"/>
+          <w:szCs w:val="24"/>
+        </w:rPr>
+        <w:tab/>
+      </w:r>
+      <w:r>
+        <w:rPr>
+          <w:bCs/>
+          <w:color w:val="auto"/>
+          <w:sz w:val="24"/>
+          <w:szCs w:val="24"/>
+        </w:rPr>
+        <w:tab/>
+        <w:t>Emma Mele (BS Environmental Science and Policy 2024).</w:t>
+      </w:r>
+    </w:p>
+    <w:p>
+      <w:pPr>
+        <w:rPr>
+          <w:bCs/>
+          <w:color w:val="auto"/>
+          <w:sz w:val="24"/>
+          <w:szCs w:val="24"/>
+        </w:rPr>
+      </w:pPr>
+      <w:r>
+        <w:rPr>
+          <w:bCs/>
+          <w:color w:val="auto"/>
+          <w:sz w:val="24"/>
+          <w:szCs w:val="24"/>
+        </w:rPr>
+        <w:t xml:space="preserve">2023 - </w:t>
+      </w:r>
+      <w:r>
+        <w:rPr>
+          <w:bCs/>
+          <w:color w:val="auto"/>
+          <w:sz w:val="24"/>
+          <w:szCs w:val="24"/>
+        </w:rPr>
+        <w:t>2025</w:t>
+      </w:r>
+      <w:r>
+        <w:rPr>
+          <w:bCs/>
+          <w:color w:val="auto"/>
+          <w:sz w:val="24"/>
+          <w:szCs w:val="24"/>
+        </w:rPr>
+        <w:tab/>
+        <w:t>Toby Jacob (BS Environmental Science and Policy 2027).</w:t>
+      </w:r>
+    </w:p>
+    <w:p>
+      <w:pPr>
+        <w:rPr>
+          <w:bCs/>
+          <w:color w:val="auto"/>
+          <w:sz w:val="24"/>
+          <w:szCs w:val="24"/>
+        </w:rPr>
+      </w:pPr>
+      <w:r>
+        <w:rPr>
+          <w:bCs/>
+          <w:color w:val="auto"/>
+          <w:sz w:val="24"/>
+          <w:szCs w:val="24"/>
+        </w:rPr>
+        <w:t xml:space="preserve">2023 - </w:t>
+      </w:r>
+      <w:r>
+        <w:rPr>
+          <w:bCs/>
+          <w:color w:val="auto"/>
+          <w:sz w:val="24"/>
+          <w:szCs w:val="24"/>
+        </w:rPr>
+        <w:t>2025</w:t>
+      </w:r>
+      <w:r>
+        <w:rPr>
+          <w:bCs/>
+          <w:color w:val="auto"/>
+          <w:sz w:val="24"/>
+          <w:szCs w:val="24"/>
+        </w:rPr>
+        <w:tab/>
+        <w:t xml:space="preserve">Emily Denio (BS Environmental </w:t>
+      </w:r>
+      <w:r>
+        <w:rPr>
+          <w:bCs/>
+          <w:color w:val="auto"/>
+          <w:sz w:val="24"/>
+          <w:szCs w:val="24"/>
+        </w:rPr>
+        <w:t>Policy</w:t>
+      </w:r>
+      <w:r>
+        <w:rPr>
+          <w:bCs/>
+          <w:color w:val="auto"/>
+          <w:sz w:val="24"/>
+          <w:szCs w:val="24"/>
+        </w:rPr>
+        <w:t xml:space="preserve"> and </w:t>
+      </w:r>
+      <w:r>
+        <w:rPr>
+          <w:bCs/>
+          <w:color w:val="auto"/>
+          <w:sz w:val="24"/>
+          <w:szCs w:val="24"/>
+        </w:rPr>
+        <w:t>Planning</w:t>
+      </w:r>
+      <w:r>
+        <w:rPr>
+          <w:bCs/>
+          <w:color w:val="auto"/>
+          <w:sz w:val="24"/>
+          <w:szCs w:val="24"/>
+        </w:rPr>
+        <w:t xml:space="preserve"> 2025).</w:t>
+      </w:r>
+    </w:p>
+    <w:p>
+      <w:pPr>
+        <w:rPr>
+          <w:bCs/>
+          <w:color w:val="auto"/>
+          <w:sz w:val="24"/>
+          <w:szCs w:val="24"/>
+        </w:rPr>
+      </w:pPr>
+      <w:r>
+        <w:rPr>
+          <w:bCs/>
+          <w:color w:val="auto"/>
+          <w:sz w:val="24"/>
+          <w:szCs w:val="24"/>
+        </w:rPr>
+        <w:t>2023</w:t>
+      </w:r>
+      <w:r>
+        <w:rPr>
+          <w:bCs/>
+          <w:color w:val="auto"/>
+          <w:sz w:val="24"/>
+          <w:szCs w:val="24"/>
+        </w:rPr>
+        <w:tab/>
+      </w:r>
+      <w:r>
+        <w:rPr>
+          <w:bCs/>
+          <w:color w:val="auto"/>
+          <w:sz w:val="24"/>
+          <w:szCs w:val="24"/>
+        </w:rPr>
+        <w:tab/>
+        <w:t>Eden Winniford (BS Environmental Science and Policy 2023).</w:t>
+      </w:r>
+    </w:p>
+    <w:p>
+      <w:pPr>
+        <w:rPr>
+          <w:bCs/>
+          <w:color w:val="auto"/>
+          <w:sz w:val="24"/>
+          <w:szCs w:val="24"/>
+        </w:rPr>
+      </w:pPr>
+      <w:r>
+        <w:rPr>
+          <w:bCs/>
+          <w:color w:val="auto"/>
+          <w:sz w:val="24"/>
+          <w:szCs w:val="24"/>
+        </w:rPr>
+        <w:lastRenderedPageBreak/>
+        <w:t>2022 - 2023</w:t>
+      </w:r>
+      <w:r>
+        <w:rPr>
+          <w:bCs/>
+          <w:color w:val="auto"/>
+          <w:sz w:val="24"/>
+          <w:szCs w:val="24"/>
+        </w:rPr>
+        <w:tab/>
+        <w:t xml:space="preserve">Elaina Legg (BS Communication and Psychology 2023). </w:t>
+      </w:r>
+    </w:p>
+    <w:p>
+      <w:pPr>
+        <w:rPr>
+          <w:bCs/>
+          <w:color w:val="auto"/>
+          <w:sz w:val="24"/>
+          <w:szCs w:val="24"/>
+        </w:rPr>
+      </w:pPr>
+      <w:r>
+        <w:rPr>
+          <w:bCs/>
+          <w:color w:val="auto"/>
+          <w:sz w:val="24"/>
+          <w:szCs w:val="24"/>
+        </w:rPr>
+        <w:t>2020</w:t>
+      </w:r>
+      <w:r>
+        <w:rPr>
+          <w:bCs/>
+          <w:color w:val="auto"/>
+          <w:sz w:val="24"/>
+          <w:szCs w:val="24"/>
+        </w:rPr>
+        <w:tab/>
+      </w:r>
+      <w:r>
+        <w:rPr>
+          <w:bCs/>
+          <w:color w:val="auto"/>
+          <w:sz w:val="24"/>
+          <w:szCs w:val="24"/>
+        </w:rPr>
+        <w:tab/>
+        <w:t xml:space="preserve">Graduate student mentor. Vertically Integrated Project, Boise State University. </w:t>
+      </w:r>
+    </w:p>
+    <w:p>
+      <w:pPr>
+        <w:rPr>
+          <w:b/>
           <w:color w:val="auto"/>
           <w:sz w:val="24"/>
           <w:szCs w:val="24"/>
@@ -1015,7 +1904,7 @@
           <w:szCs w:val="24"/>
         </w:rPr>
         <mc:AlternateContent>
-          <mc:Choice Requires="wpg">
+          <mc:Choice Requires="wps">
             <w:drawing>
               <wp:anchor distT="0" distB="0" distL="114300" distR="114300" simplePos="0" relativeHeight="251661312" behindDoc="0" locked="0" layoutInCell="1" hidden="0" allowOverlap="1" wp14:anchorId="4B9C6E1A" wp14:editId="4B38BD9A">
                 <wp:simplePos x="0" y="0"/>
@@ -1060,47 +1949,12 @@
               </wp:anchor>
             </w:drawing>
           </mc:Choice>
-          <mc:Fallback xmlns:dgm="http://schemas.openxmlformats.org/drawingml/2006/diagram" xmlns:lc="http://schemas.openxmlformats.org/drawingml/2006/lockedCanvas" xmlns:c="http://schemas.openxmlformats.org/drawingml/2006/chart" xmlns:pic="http://schemas.openxmlformats.org/drawingml/2006/picture" xmlns:a="http://schemas.openxmlformats.org/drawingml/2006/main" xmlns:sl="http://schemas.openxmlformats.org/schemaLibrary/2006/main">
-            <w:drawing>
-              <wp:anchor allowOverlap="1" behindDoc="0" distB="0" distT="0" distL="114300" distR="114300" hidden="0" layoutInCell="1" locked="0" relativeHeight="0" simplePos="0">
-                <wp:simplePos x="0" y="0"/>
-                <wp:positionH relativeFrom="column">
-                  <wp:posOffset>25401</wp:posOffset>
-                </wp:positionH>
-                <wp:positionV relativeFrom="paragraph">
-                  <wp:posOffset>165100</wp:posOffset>
-                </wp:positionV>
-                <wp:extent cx="6762750" cy="12700"/>
-                <wp:effectExtent b="0" l="0" r="0" t="0"/>
-                <wp:wrapNone/>
-                <wp:docPr id="12" name="image5.png"/>
-                <a:graphic>
-                  <a:graphicData uri="http://schemas.openxmlformats.org/drawingml/2006/picture">
-                    <pic:pic>
-                      <pic:nvPicPr>
-                        <pic:cNvPr id="0" name="image5.png"/>
-                        <pic:cNvPicPr preferRelativeResize="0"/>
-                      </pic:nvPicPr>
-                      <pic:blipFill>
-                        <a:blip r:embed="rId10"/>
-                        <a:srcRect/>
-                        <a:stretch>
-                          <a:fillRect/>
-                        </a:stretch>
-                      </pic:blipFill>
-                      <pic:spPr>
-                        <a:xfrm>
-                          <a:off x="0" y="0"/>
-                          <a:ext cx="6762750" cy="12700"/>
-                        </a:xfrm>
-                        <a:prstGeom prst="rect"/>
-                        <a:ln/>
-                      </pic:spPr>
-                    </pic:pic>
-                  </a:graphicData>
-                </a:graphic>
-              </wp:anchor>
-            </w:drawing>
+          <mc:Fallback>
+            <w:pict>
+              <v:shape w14:anchorId="2C49A112" id="Straight Arrow Connector 12" o:spid="_x0000_s1026" type="#_x0000_t32" style="position:absolute;margin-left:2pt;margin-top:13pt;width:532.5pt;height:1pt;z-index:251661312;visibility:visible;mso-wrap-style:square;mso-wrap-distance-left:9pt;mso-wrap-distance-top:0;mso-wrap-distance-right:9pt;mso-wrap-distance-bottom:0;mso-position-horizontal:absolute;mso-position-horizontal-relative:text;mso-position-vertical:absolute;mso-position-vertical-relative:text" o:gfxdata="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" strokecolor="black [3200]">
+                <v:stroke startarrowwidth="narrow" startarrowlength="short" endarrowwidth="narrow" endarrowlength="short" joinstyle="miter"/>
+              </v:shape>
+            </w:pict>
           </mc:Fallback>
         </mc:AlternateContent>
       </w:r>
@@ -1154,7 +2008,7 @@
         </w:rPr>
         <w:t xml:space="preserve">., Lubell, M., &amp; Rudnick, J. (2025) The network structure of environmental justice social movements: A case study in the California Delta. Society and Natural Resources. </w:t>
       </w:r>
-      <w:hyperlink r:id="rId11" w:history="1">
+      <w:hyperlink r:id="rId8" w:history="1">
         <w:r>
           <w:rPr>
             <w:color w:val="000000" w:themeColor="text1"/>
@@ -1212,21 +2066,7 @@
         <w:rPr>
           <w:color w:val="000000" w:themeColor="text1"/>
         </w:rPr>
-        <w:t xml:space="preserve">Heikkila, T., Gerlak, A. and </w:t>
-      </w:r>
-      <w:proofErr w:type="spellStart"/>
-      <w:r>
-        <w:rPr>
-          <w:color w:val="000000" w:themeColor="text1"/>
-        </w:rPr>
-        <w:t>Rittelmeyer</w:t>
-      </w:r>
-      <w:proofErr w:type="spellEnd"/>
-      <w:r>
-        <w:rPr>
-          <w:color w:val="000000" w:themeColor="text1"/>
-        </w:rPr>
-        <w:t xml:space="preserve">, P. (2024). Learning through Adaptive Management in the California Delta Science Enterprise. </w:t>
+        <w:t xml:space="preserve">Heikkila, T., Gerlak, A. and Rittelmeyer, P. (2024). Learning through Adaptive Management in the California Delta Science Enterprise. </w:t>
       </w:r>
       <w:r>
         <w:rPr>
@@ -1252,7 +2092,7 @@
         </w:rPr>
         <w:t> </w:t>
       </w:r>
-      <w:hyperlink r:id="rId12" w:history="1">
+      <w:hyperlink r:id="rId9" w:history="1">
         <w:r>
           <w:rPr>
             <w:rStyle w:val="Hyperlink"/>
@@ -1402,7 +2242,7 @@
         </w:rPr>
         <w:t xml:space="preserve">Policy Studies Journal. </w:t>
       </w:r>
-      <w:hyperlink r:id="rId13">
+      <w:hyperlink r:id="rId10">
         <w:r>
           <w:rPr>
             <w:rFonts w:ascii="Calibri" w:eastAsia="Calibri" w:hAnsi="Calibri" w:cs="Calibri"/>
@@ -1421,21 +2261,12 @@
           <w:color w:val="000000" w:themeColor="text1"/>
         </w:rPr>
       </w:pPr>
-      <w:proofErr w:type="spellStart"/>
       <w:r>
         <w:rPr>
           <w:rFonts w:ascii="Calibri" w:eastAsia="Calibri" w:hAnsi="Calibri" w:cs="Calibri"/>
           <w:color w:val="000000" w:themeColor="text1"/>
         </w:rPr>
-        <w:t>Rittelmeyer</w:t>
-      </w:r>
-      <w:proofErr w:type="spellEnd"/>
-      <w:r>
-        <w:rPr>
-          <w:rFonts w:ascii="Calibri" w:eastAsia="Calibri" w:hAnsi="Calibri" w:cs="Calibri"/>
-          <w:color w:val="000000" w:themeColor="text1"/>
-        </w:rPr>
-        <w:t xml:space="preserve">, P., Lubell, M., Hovis, M. Heikkila, T., Gerlak, A., &amp; </w:t>
+        <w:t xml:space="preserve">Rittelmeyer, P., Lubell, M., Hovis, M. Heikkila, T., Gerlak, A., &amp; </w:t>
       </w:r>
       <w:r>
         <w:rPr>
@@ -1462,7 +2293,7 @@
         </w:rPr>
         <w:t xml:space="preserve">Review of Policy Research. </w:t>
       </w:r>
-      <w:hyperlink r:id="rId14">
+      <w:hyperlink r:id="rId11">
         <w:r>
           <w:rPr>
             <w:rFonts w:ascii="Calibri" w:eastAsia="Calibri" w:hAnsi="Calibri" w:cs="Calibri"/>
@@ -1513,7 +2344,7 @@
         </w:rPr>
         <w:t xml:space="preserve">41. </w:t>
       </w:r>
-      <w:hyperlink r:id="rId15">
+      <w:hyperlink r:id="rId12">
         <w:r>
           <w:rPr>
             <w:rFonts w:ascii="Calibri" w:eastAsia="Calibri" w:hAnsi="Calibri" w:cs="Calibri"/>
@@ -1547,7 +2378,6 @@
           <w:szCs w:val="24"/>
           <w:u w:val="single"/>
         </w:rPr>
-        <w:lastRenderedPageBreak/>
         <w:t xml:space="preserve">Manuscripts </w:t>
       </w:r>
       <w:r>
@@ -1614,7 +2444,7 @@
           <w:rFonts w:eastAsia="Times New Roman"/>
           <w:color w:val="000000"/>
         </w:rPr>
-        <w:t>5</w:t>
+        <w:t>6</w:t>
       </w:r>
       <w:r>
         <w:rPr>
@@ -1698,7 +2528,7 @@
           <w:rFonts w:ascii="Calibri" w:eastAsia="Times New Roman" w:hAnsi="Calibri" w:cs="Calibri"/>
           <w:color w:val="000000"/>
         </w:rPr>
-        <w:t>5</w:t>
+        <w:t>6</w:t>
       </w:r>
       <w:r>
         <w:rPr>
@@ -1728,7 +2558,21 @@
           <w:rFonts w:ascii="Calibri" w:eastAsia="Times New Roman" w:hAnsi="Calibri" w:cs="Calibri"/>
           <w:color w:val="000000"/>
         </w:rPr>
-        <w:t>) [In prep]</w:t>
+        <w:t>) [</w:t>
+      </w:r>
+      <w:r>
+        <w:rPr>
+          <w:rFonts w:ascii="Calibri" w:eastAsia="Times New Roman" w:hAnsi="Calibri" w:cs="Calibri"/>
+          <w:color w:val="000000"/>
+        </w:rPr>
+        <w:t>Under review</w:t>
+      </w:r>
+      <w:r>
+        <w:rPr>
+          <w:rFonts w:ascii="Calibri" w:eastAsia="Times New Roman" w:hAnsi="Calibri" w:cs="Calibri"/>
+          <w:color w:val="000000"/>
+        </w:rPr>
+        <w:t>]</w:t>
       </w:r>
     </w:p>
     <w:p>
@@ -1789,7 +2633,7 @@
           <w:rFonts w:ascii="Calibri" w:eastAsia="Times New Roman" w:hAnsi="Calibri" w:cs="Calibri"/>
           <w:color w:val="000000"/>
         </w:rPr>
-        <w:t>5</w:t>
+        <w:t>6</w:t>
       </w:r>
       <w:r>
         <w:rPr>
@@ -1813,6 +2657,16 @@
       </w:pPr>
       <w:r>
         <w:rPr>
+          <w:b/>
+          <w:bCs/>
+        </w:rPr>
+        <w:t>Pozzi, T.,</w:t>
+      </w:r>
+      <w:r>
+        <w:t xml:space="preserve"> </w:t>
+      </w:r>
+      <w:r>
+        <w:rPr>
           <w:rFonts w:ascii="Calibri" w:eastAsia="Times New Roman" w:hAnsi="Calibri" w:cs="Calibri"/>
           <w:color w:val="000000"/>
         </w:rPr>
@@ -1822,27 +2676,46 @@
         <w:t>,</w:t>
       </w:r>
       <w:r>
-        <w:t xml:space="preserve"> Heikkila, T., </w:t>
-      </w:r>
-      <w:r>
-        <w:rPr>
-          <w:b/>
-          <w:bCs/>
-        </w:rPr>
-        <w:t>Pozzi, T.,</w:t>
-      </w:r>
-      <w:r>
-        <w:t xml:space="preserve"> &amp; Lubell, M. (2025) Finding Agreement in Collaborative Governance:</w:t>
-      </w:r>
-    </w:p>
-    <w:p>
-      <w:pPr>
-        <w:pStyle w:val="BodyText"/>
-        <w:spacing w:before="0" w:after="0"/>
-        <w:ind w:left="720"/>
-      </w:pPr>
+        <w:t xml:space="preserve"> Heikkila, T., &amp; Lubell, M. (202</w:t>
+      </w:r>
+      <w:r>
+        <w:t>6</w:t>
+      </w:r>
+      <w:r>
+        <w:t xml:space="preserve">) </w:t>
+      </w:r>
+      <w:r>
+        <w:t>Learning to Agree</w:t>
+      </w:r>
+      <w:r>
+        <w:t>:</w:t>
+      </w:r>
+      <w:r>
+        <w:t xml:space="preserve"> </w:t>
+      </w:r>
       <w:r>
         <w:t>Insights from California’s Delta Science Enterprise. [In prep]</w:t>
+      </w:r>
+      <w:r>
+        <w:tab/>
+      </w:r>
+      <w:r>
+        <w:tab/>
+      </w:r>
+      <w:r>
+        <w:tab/>
+      </w:r>
+      <w:r>
+        <w:tab/>
+      </w:r>
+      <w:r>
+        <w:tab/>
+      </w:r>
+      <w:r>
+        <w:tab/>
+      </w:r>
+      <w:r>
+        <w:tab/>
       </w:r>
       <w:r>
         <w:tab/>
@@ -1963,7 +2836,7 @@
         </w:rPr>
         <w:t xml:space="preserve"> </w:t>
       </w:r>
-      <w:hyperlink r:id="rId16" w:history="1">
+      <w:hyperlink r:id="rId13" w:history="1">
         <w:r>
           <w:rPr>
             <w:rStyle w:val="Hyperlink"/>
@@ -2114,6 +2987,7 @@
           <w:sz w:val="24"/>
           <w:szCs w:val="24"/>
         </w:rPr>
+        <w:lastRenderedPageBreak/>
         <w:t>Pozzi, T.</w:t>
       </w:r>
       <w:r>
@@ -2225,7 +3099,7 @@
         </w:rPr>
         <w:t xml:space="preserve">Wonder Labs, California. </w:t>
       </w:r>
-      <w:hyperlink r:id="rId17" w:tgtFrame="_blank" w:history="1">
+      <w:hyperlink r:id="rId14" w:tgtFrame="_blank" w:history="1">
         <w:r>
           <w:rPr>
             <w:rFonts w:eastAsia="Times New Roman"/>
@@ -2310,7 +3184,7 @@
         </w:rPr>
         <w:t xml:space="preserve">Civil, Environmental, and Sustainable Engineering Senior Theses, 34. </w:t>
       </w:r>
-      <w:hyperlink r:id="rId18" w:history="1">
+      <w:hyperlink r:id="rId15" w:history="1">
         <w:r>
           <w:rPr>
             <w:rStyle w:val="Hyperlink"/>
@@ -2407,7 +3281,7 @@
         </w:rPr>
         <w:t xml:space="preserve"> </w:t>
       </w:r>
-      <w:hyperlink r:id="rId19" w:history="1">
+      <w:hyperlink r:id="rId16" w:history="1">
         <w:r>
           <w:rPr>
             <w:rStyle w:val="Hyperlink"/>
@@ -2477,7 +3351,7 @@
         </w:rPr>
         <w:t xml:space="preserve">. Research Brief. </w:t>
       </w:r>
-      <w:hyperlink r:id="rId20" w:history="1">
+      <w:hyperlink r:id="rId17" w:history="1">
         <w:r>
           <w:rPr>
             <w:rStyle w:val="Hyperlink"/>
@@ -2652,7 +3526,6 @@
           <w:sz w:val="24"/>
           <w:szCs w:val="24"/>
         </w:rPr>
-        <w:lastRenderedPageBreak/>
         <w:t xml:space="preserve">Pozzi, T., </w:t>
       </w:r>
       <w:r>
@@ -2793,7 +3666,7 @@
         </w:rPr>
         <w:t xml:space="preserve">[ArcGIS Storymap]. Boise State University. </w:t>
       </w:r>
-      <w:hyperlink r:id="rId21" w:history="1">
+      <w:hyperlink r:id="rId18" w:history="1">
         <w:r>
           <w:rPr>
             <w:rStyle w:val="Hyperlink"/>
@@ -3062,11 +3935,7 @@
           </mc:Choice>
           <mc:Fallback>
             <w:pict>
-              <v:shapetype w14:anchorId="7987E776" id="_x0000_t32" coordsize="21600,21600" o:spt="32" o:oned="t" path="m,l21600,21600e" filled="f">
-                <v:path arrowok="t" fillok="f" o:connecttype="none"/>
-                <o:lock v:ext="edit" shapetype="t"/>
-              </v:shapetype>
-              <v:shape id="Straight Arrow Connector 1413474557" o:spid="_x0000_s1026" type="#_x0000_t32" style="position:absolute;margin-left:0;margin-top:13pt;width:532.5pt;height:1pt;z-index:251679744;visibility:visible;mso-wrap-style:square;mso-wrap-distance-left:9pt;mso-wrap-distance-top:0;mso-wrap-distance-right:9pt;mso-wrap-distance-bottom:0;mso-position-horizontal:absolute;mso-position-horizontal-relative:text;mso-position-vertical:absolute;mso-position-vertical-relative:text" o:gfxdata="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" strokecolor="black [3200]">
+              <v:shape w14:anchorId="41E246AF" id="Straight Arrow Connector 1413474557" o:spid="_x0000_s1026" type="#_x0000_t32" style="position:absolute;margin-left:0;margin-top:13pt;width:532.5pt;height:1pt;z-index:251679744;visibility:visible;mso-wrap-style:square;mso-wrap-distance-left:9pt;mso-wrap-distance-top:0;mso-wrap-distance-right:9pt;mso-wrap-distance-bottom:0;mso-position-horizontal:absolute;mso-position-horizontal-relative:text;mso-position-vertical:absolute;mso-position-vertical-relative:text" o:gfxdata="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" strokecolor="black [3200]">
                 <v:stroke startarrowwidth="narrow" startarrowlength="short" endarrowwidth="narrow" endarrowlength="short" joinstyle="miter"/>
               </v:shape>
             </w:pict>
@@ -3202,7 +4071,7 @@
           </mc:Choice>
           <mc:Fallback>
             <w:pict>
-              <v:shape w14:anchorId="4BF1836F" id="Straight Arrow Connector 6" o:spid="_x0000_s1026" type="#_x0000_t32" style="position:absolute;margin-left:0;margin-top:13pt;width:532.5pt;height:1pt;z-index:251681792;visibility:visible;mso-wrap-style:square;mso-wrap-distance-left:9pt;mso-wrap-distance-top:0;mso-wrap-distance-right:9pt;mso-wrap-distance-bottom:0;mso-position-horizontal:absolute;mso-position-horizontal-relative:text;mso-position-vertical:absolute;mso-position-vertical-relative:text" o:gfxdata="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" strokecolor="black [3200]">
+              <v:shape w14:anchorId="79F2A8B1" id="Straight Arrow Connector 6" o:spid="_x0000_s1026" type="#_x0000_t32" style="position:absolute;margin-left:0;margin-top:13pt;width:532.5pt;height:1pt;z-index:251681792;visibility:visible;mso-wrap-style:square;mso-wrap-distance-left:9pt;mso-wrap-distance-top:0;mso-wrap-distance-right:9pt;mso-wrap-distance-bottom:0;mso-position-horizontal:absolute;mso-position-horizontal-relative:text;mso-position-vertical:absolute;mso-position-vertical-relative:text" o:gfxdata="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" strokecolor="black [3200]">
                 <v:stroke startarrowwidth="narrow" startarrowlength="short" endarrowwidth="narrow" endarrowlength="short" joinstyle="miter"/>
               </v:shape>
             </w:pict>
@@ -3308,7 +4177,14 @@
         <w:rPr>
           <w:rFonts w:ascii="Calibri" w:hAnsi="Calibri" w:cs="Calibri"/>
         </w:rPr>
-        <w:t xml:space="preserve">climate change context, under direction of Dr. Mark Lubell and Dr. Sarah McCullough. Funded by </w:t>
+        <w:t xml:space="preserve">climate change </w:t>
+      </w:r>
+      <w:r>
+        <w:rPr>
+          <w:rFonts w:ascii="Calibri" w:hAnsi="Calibri" w:cs="Calibri"/>
+        </w:rPr>
+        <w:lastRenderedPageBreak/>
+        <w:t xml:space="preserve">context, under direction of Dr. Mark Lubell and Dr. Sarah McCullough. Funded by </w:t>
       </w:r>
       <w:r>
         <w:rPr>
@@ -3658,370 +4534,6 @@
           <w:rFonts w:ascii="Calibri" w:hAnsi="Calibri" w:cs="Calibri"/>
         </w:rPr>
         <w:t xml:space="preserve">. Funded by the Department of Homeland Security. </w:t>
-      </w:r>
-    </w:p>
-    <w:p>
-      <w:pPr>
-        <w:rPr>
-          <w:b/>
-          <w:color w:val="auto"/>
-          <w:sz w:val="24"/>
-          <w:szCs w:val="24"/>
-        </w:rPr>
-      </w:pPr>
-      <w:r>
-        <w:rPr>
-          <w:noProof/>
-          <w:color w:val="auto"/>
-          <w:sz w:val="24"/>
-          <w:szCs w:val="24"/>
-        </w:rPr>
-        <mc:AlternateContent>
-          <mc:Choice Requires="wps">
-            <w:drawing>
-              <wp:anchor distT="0" distB="0" distL="114300" distR="114300" simplePos="0" relativeHeight="251687936" behindDoc="0" locked="0" layoutInCell="1" hidden="0" allowOverlap="1" wp14:anchorId="0A4470DA" wp14:editId="7EAA1722">
-                <wp:simplePos x="0" y="0"/>
-                <wp:positionH relativeFrom="column">
-                  <wp:posOffset>1</wp:posOffset>
-                </wp:positionH>
-                <wp:positionV relativeFrom="paragraph">
-                  <wp:posOffset>165100</wp:posOffset>
-                </wp:positionV>
-                <wp:extent cx="6762750" cy="12700"/>
-                <wp:effectExtent l="0" t="0" r="0" b="0"/>
-                <wp:wrapNone/>
-                <wp:docPr id="1875486840" name="Straight Arrow Connector 1875486840"/>
-                <wp:cNvGraphicFramePr/>
-                <a:graphic xmlns:a="http://schemas.openxmlformats.org/drawingml/2006/main">
-                  <a:graphicData uri="http://schemas.microsoft.com/office/word/2010/wordprocessingShape">
-                    <wps:wsp>
-                      <wps:cNvCnPr/>
-                      <wps:spPr>
-                        <a:xfrm>
-                          <a:off x="1964625" y="3780000"/>
-                          <a:ext cx="6762750" cy="0"/>
-                        </a:xfrm>
-                        <a:prstGeom prst="straightConnector1">
-                          <a:avLst/>
-                        </a:prstGeom>
-                        <a:noFill/>
-                        <a:ln w="9525" cap="flat" cmpd="sng">
-                          <a:solidFill>
-                            <a:schemeClr val="dk1"/>
-                          </a:solidFill>
-                          <a:prstDash val="solid"/>
-                          <a:miter lim="800000"/>
-                          <a:headEnd type="none" w="sm" len="sm"/>
-                          <a:tailEnd type="none" w="sm" len="sm"/>
-                        </a:ln>
-                      </wps:spPr>
-                      <wps:bodyPr/>
-                    </wps:wsp>
-                  </a:graphicData>
-                </a:graphic>
-              </wp:anchor>
-            </w:drawing>
-          </mc:Choice>
-          <mc:Fallback>
-            <w:pict>
-              <v:shape w14:anchorId="12582274" id="Straight Arrow Connector 1875486840" o:spid="_x0000_s1026" type="#_x0000_t32" style="position:absolute;margin-left:0;margin-top:13pt;width:532.5pt;height:1pt;z-index:251687936;visibility:visible;mso-wrap-style:square;mso-wrap-distance-left:9pt;mso-wrap-distance-top:0;mso-wrap-distance-right:9pt;mso-wrap-distance-bottom:0;mso-position-horizontal:absolute;mso-position-horizontal-relative:text;mso-position-vertical:absolute;mso-position-vertical-relative:text" o:gfxdata="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" strokecolor="black [3200]">
-                <v:stroke startarrowwidth="narrow" startarrowlength="short" endarrowwidth="narrow" endarrowlength="short" joinstyle="miter"/>
-              </v:shape>
-            </w:pict>
-          </mc:Fallback>
-        </mc:AlternateContent>
-      </w:r>
-      <w:r>
-        <w:rPr>
-          <w:b/>
-          <w:color w:val="auto"/>
-          <w:sz w:val="24"/>
-          <w:szCs w:val="24"/>
-        </w:rPr>
-        <w:t xml:space="preserve">RELEVANT </w:t>
-      </w:r>
-      <w:r>
-        <w:rPr>
-          <w:b/>
-          <w:color w:val="auto"/>
-          <w:sz w:val="24"/>
-          <w:szCs w:val="24"/>
-        </w:rPr>
-        <w:t>WORK EXPERIENCE</w:t>
-      </w:r>
-    </w:p>
-    <w:p>
-      <w:pPr>
-        <w:ind w:left="1440" w:hanging="1440"/>
-        <w:rPr>
-          <w:color w:val="000000" w:themeColor="text1"/>
-          <w:sz w:val="24"/>
-          <w:szCs w:val="24"/>
-        </w:rPr>
-      </w:pPr>
-      <w:r>
-        <w:rPr>
-          <w:color w:val="000000" w:themeColor="text1"/>
-          <w:sz w:val="24"/>
-          <w:szCs w:val="24"/>
-        </w:rPr>
-        <w:t>2015 - 2016</w:t>
-      </w:r>
-      <w:r>
-        <w:rPr>
-          <w:b/>
-          <w:bCs/>
-          <w:color w:val="000000" w:themeColor="text1"/>
-          <w:sz w:val="24"/>
-          <w:szCs w:val="24"/>
-        </w:rPr>
-        <w:t xml:space="preserve"> </w:t>
-      </w:r>
-      <w:r>
-        <w:rPr>
-          <w:b/>
-          <w:bCs/>
-          <w:color w:val="000000" w:themeColor="text1"/>
-          <w:sz w:val="24"/>
-          <w:szCs w:val="24"/>
-        </w:rPr>
-        <w:tab/>
-      </w:r>
-      <w:r>
-        <w:rPr>
-          <w:color w:val="000000" w:themeColor="text1"/>
-          <w:sz w:val="24"/>
-          <w:szCs w:val="24"/>
-        </w:rPr>
-        <w:t xml:space="preserve">Assistant Engineer at Schaaf &amp; Wheeler, San Francisco, CA. </w:t>
-      </w:r>
-      <w:r>
-        <w:rPr>
-          <w:color w:val="000000" w:themeColor="text1"/>
-          <w:sz w:val="24"/>
-          <w:szCs w:val="24"/>
-        </w:rPr>
-        <w:t>Duties included: p</w:t>
-      </w:r>
-      <w:r>
-        <w:rPr>
-          <w:color w:val="000000" w:themeColor="text1"/>
-          <w:sz w:val="24"/>
-          <w:szCs w:val="24"/>
-        </w:rPr>
-        <w:t>rovid</w:t>
-      </w:r>
-      <w:r>
-        <w:rPr>
-          <w:color w:val="000000" w:themeColor="text1"/>
-          <w:sz w:val="24"/>
-          <w:szCs w:val="24"/>
-        </w:rPr>
-        <w:t>ing</w:t>
-      </w:r>
-      <w:r>
-        <w:rPr>
-          <w:color w:val="000000" w:themeColor="text1"/>
-          <w:sz w:val="24"/>
-          <w:szCs w:val="24"/>
-        </w:rPr>
-        <w:t xml:space="preserve"> technical assistance to a wide variety of storm water-related projects, conduct</w:t>
-      </w:r>
-      <w:r>
-        <w:rPr>
-          <w:color w:val="000000" w:themeColor="text1"/>
-          <w:sz w:val="24"/>
-          <w:szCs w:val="24"/>
-        </w:rPr>
-        <w:t>ing</w:t>
-      </w:r>
-      <w:r>
-        <w:rPr>
-          <w:color w:val="000000" w:themeColor="text1"/>
-          <w:sz w:val="24"/>
-          <w:szCs w:val="24"/>
-        </w:rPr>
-        <w:t xml:space="preserve"> third party design reviews to ensure development projects </w:t>
-      </w:r>
-      <w:proofErr w:type="gramStart"/>
-      <w:r>
-        <w:rPr>
-          <w:color w:val="000000" w:themeColor="text1"/>
-          <w:sz w:val="24"/>
-          <w:szCs w:val="24"/>
-        </w:rPr>
-        <w:t>are in compliance with</w:t>
-      </w:r>
-      <w:proofErr w:type="gramEnd"/>
-      <w:r>
-        <w:rPr>
-          <w:color w:val="000000" w:themeColor="text1"/>
-          <w:sz w:val="24"/>
-          <w:szCs w:val="24"/>
-        </w:rPr>
-        <w:t xml:space="preserve"> regional storm water </w:t>
-      </w:r>
-      <w:r>
-        <w:rPr>
-          <w:color w:val="000000" w:themeColor="text1"/>
-          <w:sz w:val="24"/>
-          <w:szCs w:val="24"/>
-        </w:rPr>
-        <w:lastRenderedPageBreak/>
-        <w:t>regulations, develop</w:t>
-      </w:r>
-      <w:r>
-        <w:rPr>
-          <w:color w:val="000000" w:themeColor="text1"/>
-          <w:sz w:val="24"/>
-          <w:szCs w:val="24"/>
-        </w:rPr>
-        <w:t>ing</w:t>
-      </w:r>
-      <w:r>
-        <w:rPr>
-          <w:color w:val="000000" w:themeColor="text1"/>
-          <w:sz w:val="24"/>
-          <w:szCs w:val="24"/>
-        </w:rPr>
-        <w:t xml:space="preserve"> hydrology and hydraulic analysis and reports, and </w:t>
-      </w:r>
-      <w:r>
-        <w:rPr>
-          <w:color w:val="000000" w:themeColor="text1"/>
-          <w:sz w:val="24"/>
-          <w:szCs w:val="24"/>
-        </w:rPr>
-        <w:t>modeling</w:t>
-      </w:r>
-      <w:r>
-        <w:rPr>
-          <w:color w:val="000000" w:themeColor="text1"/>
-          <w:sz w:val="24"/>
-          <w:szCs w:val="24"/>
-        </w:rPr>
-        <w:t xml:space="preserve"> complex storm drain systems for municipalities. Proficient in ArcGIS, AutoCAD, HEC-HMS/RAS/SSP, MIKE URBAN, and Microsoft Office</w:t>
-      </w:r>
-    </w:p>
-    <w:p>
-      <w:pPr>
-        <w:ind w:left="1440" w:hanging="1440"/>
-        <w:rPr>
-          <w:color w:val="000000" w:themeColor="text1"/>
-          <w:sz w:val="24"/>
-          <w:szCs w:val="24"/>
-        </w:rPr>
-      </w:pPr>
-    </w:p>
-    <w:p>
-      <w:pPr>
-        <w:ind w:left="1440" w:hanging="1440"/>
-        <w:rPr>
-          <w:color w:val="000000" w:themeColor="text1"/>
-          <w:sz w:val="24"/>
-          <w:szCs w:val="24"/>
-        </w:rPr>
-      </w:pPr>
-      <w:r>
-        <w:rPr>
-          <w:color w:val="000000" w:themeColor="text1"/>
-          <w:sz w:val="24"/>
-          <w:szCs w:val="24"/>
-        </w:rPr>
-        <w:t>2013 – 2015</w:t>
-      </w:r>
-      <w:r>
-        <w:rPr>
-          <w:color w:val="000000" w:themeColor="text1"/>
-          <w:sz w:val="24"/>
-          <w:szCs w:val="24"/>
-        </w:rPr>
-        <w:tab/>
-        <w:t xml:space="preserve">Engineering Intern at Santa Clara Valley Water District, San Clara, CA. Project management for </w:t>
-      </w:r>
-      <w:r>
-        <w:rPr>
-          <w:color w:val="000000" w:themeColor="text1"/>
-          <w:sz w:val="24"/>
-          <w:szCs w:val="24"/>
-        </w:rPr>
-        <w:t xml:space="preserve">a </w:t>
-      </w:r>
-      <w:r>
-        <w:rPr>
-          <w:color w:val="000000" w:themeColor="text1"/>
-          <w:sz w:val="24"/>
-          <w:szCs w:val="24"/>
-        </w:rPr>
-        <w:t xml:space="preserve"> $200M water treatment plant retrofit project. Duties included: organizing and tracking current and/or proposed designs for the project through continual communication between all project reviewers and consultants, researching alternative sustainability methods such as alternative sludge disposal options and renewable energy sources, implementing the hydraulic analysis program H2ONet to analyze various design elements in the project, and orchestrating technical meetings between the District engineers and </w:t>
-      </w:r>
-      <w:proofErr w:type="spellStart"/>
-      <w:r>
-        <w:rPr>
-          <w:color w:val="000000" w:themeColor="text1"/>
-          <w:sz w:val="24"/>
-          <w:szCs w:val="24"/>
-        </w:rPr>
-        <w:t>Rinconada</w:t>
-      </w:r>
-      <w:proofErr w:type="spellEnd"/>
-      <w:r>
-        <w:rPr>
-          <w:color w:val="000000" w:themeColor="text1"/>
-          <w:sz w:val="24"/>
-          <w:szCs w:val="24"/>
-        </w:rPr>
-        <w:t xml:space="preserve"> Water Treatment Plant operations staff to make decisions on aspects of the project.</w:t>
-      </w:r>
-    </w:p>
-    <w:p>
-      <w:pPr>
-        <w:ind w:left="1440" w:hanging="1440"/>
-        <w:rPr>
-          <w:color w:val="000000" w:themeColor="text1"/>
-          <w:sz w:val="24"/>
-          <w:szCs w:val="24"/>
-        </w:rPr>
-      </w:pPr>
-    </w:p>
-    <w:p>
-      <w:pPr>
-        <w:ind w:left="1440" w:hanging="1440"/>
-        <w:rPr>
-          <w:color w:val="000000" w:themeColor="text1"/>
-          <w:sz w:val="24"/>
-          <w:szCs w:val="24"/>
-        </w:rPr>
-      </w:pPr>
-      <w:r>
-        <w:rPr>
-          <w:color w:val="000000" w:themeColor="text1"/>
-          <w:sz w:val="24"/>
-          <w:szCs w:val="24"/>
-        </w:rPr>
-        <w:t>2012 – 2013</w:t>
-      </w:r>
-      <w:r>
-        <w:rPr>
-          <w:color w:val="000000" w:themeColor="text1"/>
-          <w:sz w:val="24"/>
-          <w:szCs w:val="24"/>
-        </w:rPr>
-        <w:tab/>
-        <w:t xml:space="preserve">Event Planning and Marketing Assistant at the Santa Clara University’s Food and Agribusiness Institute. Managed the Institute’s website and created the bi-annual newsletter. Prepared for events by completing food orders, facility order, photography, and promotion of the event. </w:t>
-      </w:r>
-    </w:p>
-    <w:p>
-      <w:pPr>
-        <w:rPr>
-          <w:b/>
-          <w:color w:val="auto"/>
-          <w:sz w:val="24"/>
-          <w:szCs w:val="24"/>
-        </w:rPr>
-      </w:pPr>
-      <w:r>
-        <w:t xml:space="preserve"> </w:t>
       </w:r>
     </w:p>
     <w:p>
@@ -4088,7 +4600,7 @@
           </mc:Choice>
           <mc:Fallback>
             <w:pict>
-              <v:shape w14:anchorId="446EEDBF" id="Straight Arrow Connector 15" o:spid="_x0000_s1026" type="#_x0000_t32" style="position:absolute;margin-left:1pt;margin-top:13pt;width:532.5pt;height:1pt;z-index:251689984;visibility:visible;mso-wrap-style:square;mso-wrap-distance-left:9pt;mso-wrap-distance-top:0;mso-wrap-distance-right:9pt;mso-wrap-distance-bottom:0;mso-position-horizontal:absolute;mso-position-horizontal-relative:text;mso-position-vertical:absolute;mso-position-vertical-relative:text" o:gfxdata="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" strokecolor="black [3200]">
+              <v:shape w14:anchorId="6AAC9635" id="Straight Arrow Connector 15" o:spid="_x0000_s1026" type="#_x0000_t32" style="position:absolute;margin-left:1pt;margin-top:13pt;width:532.5pt;height:1pt;z-index:251689984;visibility:visible;mso-wrap-style:square;mso-wrap-distance-left:9pt;mso-wrap-distance-top:0;mso-wrap-distance-right:9pt;mso-wrap-distance-bottom:0;mso-position-horizontal:absolute;mso-position-horizontal-relative:text;mso-position-vertical:absolute;mso-position-vertical-relative:text" o:gfxdata="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" strokecolor="black [3200]">
                 <v:stroke startarrowwidth="narrow" startarrowlength="short" endarrowwidth="narrow" endarrowlength="short" joinstyle="miter"/>
               </v:shape>
             </w:pict>
@@ -4147,6 +4659,86 @@
           <w:sz w:val="24"/>
           <w:szCs w:val="24"/>
         </w:rPr>
+        <w:t>2025 - Present</w:t>
+      </w:r>
+      <w:r>
+        <w:rPr>
+          <w:bCs/>
+          <w:color w:val="auto"/>
+          <w:sz w:val="24"/>
+          <w:szCs w:val="24"/>
+        </w:rPr>
+        <w:tab/>
+        <w:t>Planner. Delta Climate Adaptation Team.</w:t>
+      </w:r>
+    </w:p>
+    <w:p>
+      <w:pPr>
+        <w:ind w:left="1440" w:hanging="1440"/>
+        <w:rPr>
+          <w:bCs/>
+          <w:color w:val="auto"/>
+          <w:sz w:val="24"/>
+          <w:szCs w:val="24"/>
+        </w:rPr>
+      </w:pPr>
+      <w:r>
+        <w:rPr>
+          <w:bCs/>
+          <w:color w:val="auto"/>
+          <w:sz w:val="24"/>
+          <w:szCs w:val="24"/>
+        </w:rPr>
+        <w:t>2025 - Present Leader. Bay-Delta Social Science Community of Practice.</w:t>
+      </w:r>
+    </w:p>
+    <w:p>
+      <w:pPr>
+        <w:ind w:left="1440" w:hanging="1440"/>
+        <w:rPr>
+          <w:bCs/>
+          <w:color w:val="auto"/>
+          <w:sz w:val="24"/>
+          <w:szCs w:val="24"/>
+        </w:rPr>
+      </w:pPr>
+      <w:r>
+        <w:rPr>
+          <w:bCs/>
+          <w:color w:val="auto"/>
+          <w:sz w:val="24"/>
+          <w:szCs w:val="24"/>
+        </w:rPr>
+        <w:t>2025</w:t>
+      </w:r>
+      <w:r>
+        <w:rPr>
+          <w:bCs/>
+          <w:color w:val="auto"/>
+          <w:sz w:val="24"/>
+          <w:szCs w:val="24"/>
+        </w:rPr>
+        <w:tab/>
+        <w:t xml:space="preserve">Coordinator. Delta Carbon Research Sub-team. </w:t>
+      </w:r>
+    </w:p>
+    <w:p>
+      <w:pPr>
+        <w:ind w:left="1440" w:hanging="1440"/>
+        <w:rPr>
+          <w:bCs/>
+          <w:color w:val="auto"/>
+          <w:sz w:val="24"/>
+          <w:szCs w:val="24"/>
+        </w:rPr>
+      </w:pPr>
+      <w:r>
+        <w:rPr>
+          <w:bCs/>
+          <w:color w:val="auto"/>
+          <w:sz w:val="24"/>
+          <w:szCs w:val="24"/>
+        </w:rPr>
         <w:t>2023</w:t>
       </w:r>
       <w:r>
@@ -4267,7 +4859,7 @@
         <w:ind w:left="1440" w:hanging="1440"/>
         <w:rPr>
           <w:bCs/>
-          <w:iCs/>
+          <w:i/>
           <w:color w:val="auto"/>
           <w:sz w:val="24"/>
           <w:szCs w:val="24"/>
@@ -4300,7 +4892,7 @@
           <w:sz w:val="24"/>
           <w:szCs w:val="24"/>
         </w:rPr>
-        <w:t xml:space="preserve"> and </w:t>
+        <w:t xml:space="preserve">, </w:t>
       </w:r>
       <w:r>
         <w:rPr>
@@ -4311,6 +4903,36 @@
           <w:szCs w:val="24"/>
         </w:rPr>
         <w:t>Ecology and Society</w:t>
+      </w:r>
+      <w:r>
+        <w:rPr>
+          <w:bCs/>
+          <w:i/>
+          <w:color w:val="auto"/>
+          <w:sz w:val="24"/>
+          <w:szCs w:val="24"/>
+        </w:rPr>
+        <w:t xml:space="preserve">, </w:t>
+      </w:r>
+      <w:r>
+        <w:rPr>
+          <w:bCs/>
+          <w:iCs/>
+          <w:color w:val="auto"/>
+          <w:sz w:val="24"/>
+          <w:szCs w:val="24"/>
+        </w:rPr>
+        <w:t xml:space="preserve">and </w:t>
+      </w:r>
+      <w:r>
+        <w:rPr>
+          <w:bCs/>
+          <w:i/>
+          <w:color w:val="auto"/>
+          <w:sz w:val="24"/>
+          <w:szCs w:val="24"/>
+        </w:rPr>
+        <w:t>Policy Design and Practice</w:t>
       </w:r>
     </w:p>
     <w:p>
@@ -4596,7 +5218,7 @@
           <w:szCs w:val="24"/>
         </w:rPr>
         <mc:AlternateContent>
-          <mc:Choice Requires="wpg">
+          <mc:Choice Requires="wps">
             <w:drawing>
               <wp:anchor distT="0" distB="0" distL="114300" distR="114300" simplePos="0" relativeHeight="251662336" behindDoc="0" locked="0" layoutInCell="1" hidden="0" allowOverlap="1" wp14:anchorId="5ACE94D6" wp14:editId="4230B20E">
                 <wp:simplePos x="0" y="0"/>
@@ -4641,47 +5263,12 @@
               </wp:anchor>
             </w:drawing>
           </mc:Choice>
-          <mc:Fallback xmlns:dgm="http://schemas.openxmlformats.org/drawingml/2006/diagram" xmlns:lc="http://schemas.openxmlformats.org/drawingml/2006/lockedCanvas" xmlns:c="http://schemas.openxmlformats.org/drawingml/2006/chart" xmlns:pic="http://schemas.openxmlformats.org/drawingml/2006/picture" xmlns:a="http://schemas.openxmlformats.org/drawingml/2006/main" xmlns:sl="http://schemas.openxmlformats.org/schemaLibrary/2006/main">
-            <w:drawing>
-              <wp:anchor allowOverlap="1" behindDoc="0" distB="0" distT="0" distL="114300" distR="114300" hidden="0" layoutInCell="1" locked="0" relativeHeight="0" simplePos="0">
-                <wp:simplePos x="0" y="0"/>
-                <wp:positionH relativeFrom="column">
-                  <wp:posOffset>1</wp:posOffset>
-                </wp:positionH>
-                <wp:positionV relativeFrom="paragraph">
-                  <wp:posOffset>165100</wp:posOffset>
-                </wp:positionV>
-                <wp:extent cx="6762750" cy="12700"/>
-                <wp:effectExtent b="0" l="0" r="0" t="0"/>
-                <wp:wrapNone/>
-                <wp:docPr id="10" name="image3.png"/>
-                <a:graphic>
-                  <a:graphicData uri="http://schemas.openxmlformats.org/drawingml/2006/picture">
-                    <pic:pic>
-                      <pic:nvPicPr>
-                        <pic:cNvPr id="0" name="image3.png"/>
-                        <pic:cNvPicPr preferRelativeResize="0"/>
-                      </pic:nvPicPr>
-                      <pic:blipFill>
-                        <a:blip r:embed="rId22"/>
-                        <a:srcRect/>
-                        <a:stretch>
-                          <a:fillRect/>
-                        </a:stretch>
-                      </pic:blipFill>
-                      <pic:spPr>
-                        <a:xfrm>
-                          <a:off x="0" y="0"/>
-                          <a:ext cx="6762750" cy="12700"/>
-                        </a:xfrm>
-                        <a:prstGeom prst="rect"/>
-                        <a:ln/>
-                      </pic:spPr>
-                    </pic:pic>
-                  </a:graphicData>
-                </a:graphic>
-              </wp:anchor>
-            </w:drawing>
+          <mc:Fallback>
+            <w:pict>
+              <v:shape w14:anchorId="047B1806" id="Straight Arrow Connector 10" o:spid="_x0000_s1026" type="#_x0000_t32" style="position:absolute;margin-left:0;margin-top:13pt;width:532.5pt;height:1pt;z-index:251662336;visibility:visible;mso-wrap-style:square;mso-wrap-distance-left:9pt;mso-wrap-distance-top:0;mso-wrap-distance-right:9pt;mso-wrap-distance-bottom:0;mso-position-horizontal:absolute;mso-position-horizontal-relative:text;mso-position-vertical:absolute;mso-position-vertical-relative:text" o:gfxdata="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" strokecolor="black [3200]">
+                <v:stroke startarrowwidth="narrow" startarrowlength="short" endarrowwidth="narrow" endarrowlength="short" joinstyle="miter"/>
+              </v:shape>
+            </w:pict>
           </mc:Fallback>
         </mc:AlternateContent>
       </w:r>
@@ -4734,37 +5321,61 @@
         <w:rPr>
           <w:rFonts w:ascii="Calibri" w:hAnsi="Calibri" w:cs="Calibri"/>
         </w:rPr>
-        <w:t>5</w:t>
-      </w:r>
-      <w:r>
-        <w:rPr>
-          <w:rFonts w:ascii="Calibri" w:hAnsi="Calibri" w:cs="Calibri"/>
-        </w:rPr>
-        <w:t>) “</w:t>
-      </w:r>
-      <w:r>
-        <w:rPr>
-          <w:rFonts w:ascii="Calibri" w:hAnsi="Calibri" w:cs="Calibri"/>
-        </w:rPr>
-        <w:t>From science to policy: Social science integration from an environmental governance perspective.”</w:t>
-      </w:r>
-      <w:r>
-        <w:rPr>
-          <w:rFonts w:ascii="Calibri" w:hAnsi="Calibri" w:cs="Calibri"/>
-        </w:rPr>
-        <w:t xml:space="preserve"> Presented for: </w:t>
-      </w:r>
-      <w:r>
-        <w:rPr>
-          <w:rFonts w:ascii="Calibri" w:hAnsi="Calibri" w:cs="Calibri"/>
-        </w:rPr>
-        <w:t>Bay-Delta Social Science Community of Practice</w:t>
-      </w:r>
-      <w:r>
-        <w:rPr>
-          <w:rFonts w:ascii="Calibri" w:hAnsi="Calibri" w:cs="Calibri"/>
-        </w:rPr>
-        <w:t xml:space="preserve"> (in-person).</w:t>
+        <w:t>6</w:t>
+      </w:r>
+      <w:r>
+        <w:rPr>
+          <w:rFonts w:ascii="Calibri" w:hAnsi="Calibri" w:cs="Calibri"/>
+        </w:rPr>
+        <w:t>)</w:t>
+      </w:r>
+      <w:r>
+        <w:rPr>
+          <w:rFonts w:ascii="Calibri" w:hAnsi="Calibri" w:cs="Calibri"/>
+        </w:rPr>
+        <w:t xml:space="preserve"> “Micro-training on Governance”. </w:t>
+      </w:r>
+      <w:r>
+        <w:rPr>
+          <w:rFonts w:ascii="Calibri" w:hAnsi="Calibri" w:cs="Calibri"/>
+        </w:rPr>
+        <w:t xml:space="preserve">Presented for: </w:t>
+      </w:r>
+      <w:r>
+        <w:rPr>
+          <w:rFonts w:ascii="Calibri" w:hAnsi="Calibri" w:cs="Calibri"/>
+        </w:rPr>
+        <w:t>D</w:t>
+      </w:r>
+      <w:r>
+        <w:rPr>
+          <w:rFonts w:ascii="Calibri" w:hAnsi="Calibri" w:cs="Calibri"/>
+        </w:rPr>
+        <w:t>elta Stewardship Council</w:t>
+      </w:r>
+      <w:r>
+        <w:rPr>
+          <w:rFonts w:ascii="Calibri" w:hAnsi="Calibri" w:cs="Calibri"/>
+        </w:rPr>
+        <w:t xml:space="preserve">. </w:t>
+      </w:r>
+      <w:r>
+        <w:rPr>
+          <w:rFonts w:ascii="Calibri" w:hAnsi="Calibri" w:cs="Calibri"/>
+        </w:rPr>
+        <w:t>(</w:t>
+      </w:r>
+      <w:r>
+        <w:rPr>
+          <w:rFonts w:ascii="Calibri" w:hAnsi="Calibri" w:cs="Calibri"/>
+        </w:rPr>
+        <w:t>in-person</w:t>
+      </w:r>
+      <w:r>
+        <w:rPr>
+          <w:rFonts w:ascii="Calibri" w:hAnsi="Calibri" w:cs="Calibri"/>
+        </w:rPr>
+        <w:t>).</w:t>
       </w:r>
     </w:p>
     <w:p>
@@ -4787,6 +5398,149 @@
         <w:rPr>
           <w:rFonts w:ascii="Calibri" w:hAnsi="Calibri" w:cs="Calibri"/>
         </w:rPr>
+        <w:t xml:space="preserve"> (202</w:t>
+      </w:r>
+      <w:r>
+        <w:rPr>
+          <w:rFonts w:ascii="Calibri" w:hAnsi="Calibri" w:cs="Calibri"/>
+        </w:rPr>
+        <w:t>6</w:t>
+      </w:r>
+      <w:r>
+        <w:rPr>
+          <w:rFonts w:ascii="Calibri" w:hAnsi="Calibri" w:cs="Calibri"/>
+        </w:rPr>
+        <w:t>) “</w:t>
+      </w:r>
+      <w:r>
+        <w:rPr>
+          <w:rFonts w:ascii="Calibri" w:hAnsi="Calibri" w:cs="Calibri"/>
+        </w:rPr>
+        <w:t>Role of regional governance in climate adaptation planning.”</w:t>
+      </w:r>
+      <w:r>
+        <w:rPr>
+          <w:rFonts w:ascii="Calibri" w:hAnsi="Calibri" w:cs="Calibri"/>
+        </w:rPr>
+        <w:t xml:space="preserve"> Presented for: </w:t>
+      </w:r>
+      <w:r>
+        <w:rPr>
+          <w:rFonts w:ascii="Calibri" w:hAnsi="Calibri" w:cs="Calibri"/>
+        </w:rPr>
+        <w:t>CA Department of Water Resources Climate Science and Innovation Series</w:t>
+      </w:r>
+      <w:r>
+        <w:rPr>
+          <w:rFonts w:ascii="Calibri" w:hAnsi="Calibri" w:cs="Calibri"/>
+        </w:rPr>
+        <w:t xml:space="preserve"> (</w:t>
+      </w:r>
+      <w:r>
+        <w:rPr>
+          <w:rFonts w:ascii="Calibri" w:hAnsi="Calibri" w:cs="Calibri"/>
+        </w:rPr>
+        <w:t>in-person</w:t>
+      </w:r>
+      <w:r>
+        <w:rPr>
+          <w:rFonts w:ascii="Calibri" w:hAnsi="Calibri" w:cs="Calibri"/>
+        </w:rPr>
+        <w:t>).</w:t>
+      </w:r>
+    </w:p>
+    <w:p>
+      <w:pPr>
+        <w:pStyle w:val="FirstParagraph"/>
+        <w:spacing w:before="0"/>
+        <w:rPr>
+          <w:rFonts w:ascii="Calibri" w:hAnsi="Calibri" w:cs="Calibri"/>
+        </w:rPr>
+      </w:pPr>
+      <w:r>
+        <w:rPr>
+          <w:rFonts w:ascii="Calibri" w:hAnsi="Calibri" w:cs="Calibri"/>
+          <w:b/>
+          <w:bCs/>
+        </w:rPr>
+        <w:lastRenderedPageBreak/>
+        <w:t>Pozzi, T.</w:t>
+      </w:r>
+      <w:r>
+        <w:rPr>
+          <w:rFonts w:ascii="Calibri" w:hAnsi="Calibri" w:cs="Calibri"/>
+        </w:rPr>
+        <w:t xml:space="preserve"> (202</w:t>
+      </w:r>
+      <w:r>
+        <w:rPr>
+          <w:rFonts w:ascii="Calibri" w:hAnsi="Calibri" w:cs="Calibri"/>
+        </w:rPr>
+        <w:t>5</w:t>
+      </w:r>
+      <w:r>
+        <w:rPr>
+          <w:rFonts w:ascii="Calibri" w:hAnsi="Calibri" w:cs="Calibri"/>
+        </w:rPr>
+        <w:t>) “</w:t>
+      </w:r>
+      <w:r>
+        <w:rPr>
+          <w:rFonts w:ascii="Calibri" w:hAnsi="Calibri" w:cs="Calibri"/>
+        </w:rPr>
+        <w:t>From science to policy: Social science integration from an environmental governance perspective.”</w:t>
+      </w:r>
+      <w:r>
+        <w:rPr>
+          <w:rFonts w:ascii="Calibri" w:hAnsi="Calibri" w:cs="Calibri"/>
+        </w:rPr>
+        <w:t xml:space="preserve"> Presented for: </w:t>
+      </w:r>
+      <w:r>
+        <w:rPr>
+          <w:rFonts w:ascii="Calibri" w:hAnsi="Calibri" w:cs="Calibri"/>
+        </w:rPr>
+        <w:t>Bay-Delta Social Science Community of Practice</w:t>
+      </w:r>
+      <w:r>
+        <w:rPr>
+          <w:rFonts w:ascii="Calibri" w:hAnsi="Calibri" w:cs="Calibri"/>
+        </w:rPr>
+        <w:t xml:space="preserve"> (</w:t>
+      </w:r>
+      <w:r>
+        <w:rPr>
+          <w:rFonts w:ascii="Calibri" w:hAnsi="Calibri" w:cs="Calibri"/>
+        </w:rPr>
+        <w:t>virtual</w:t>
+      </w:r>
+      <w:r>
+        <w:rPr>
+          <w:rFonts w:ascii="Calibri" w:hAnsi="Calibri" w:cs="Calibri"/>
+        </w:rPr>
+        <w:t>).</w:t>
+      </w:r>
+    </w:p>
+    <w:p>
+      <w:pPr>
+        <w:pStyle w:val="FirstParagraph"/>
+        <w:spacing w:before="0"/>
+        <w:rPr>
+          <w:rFonts w:ascii="Calibri" w:hAnsi="Calibri" w:cs="Calibri"/>
+        </w:rPr>
+      </w:pPr>
+      <w:r>
+        <w:rPr>
+          <w:rFonts w:ascii="Calibri" w:hAnsi="Calibri" w:cs="Calibri"/>
+          <w:b/>
+          <w:bCs/>
+        </w:rPr>
+        <w:t>Pozzi, T.</w:t>
+      </w:r>
+      <w:r>
+        <w:rPr>
+          <w:rFonts w:ascii="Calibri" w:hAnsi="Calibri" w:cs="Calibri"/>
+        </w:rPr>
         <w:t xml:space="preserve"> (2024) “Delta Adaptation Governance.” Presented for: Early Career Leadership Workshop (in-person).</w:t>
       </w:r>
     </w:p>
@@ -4827,7 +5581,6 @@
           <w:b/>
           <w:bCs/>
         </w:rPr>
-        <w:lastRenderedPageBreak/>
         <w:t>Pozzi, T.</w:t>
       </w:r>
       <w:r>
@@ -4979,6 +5732,228 @@
         </w:rPr>
         <w:t>Conference Activity</w:t>
       </w:r>
+    </w:p>
+    <w:p>
+      <w:pPr>
+        <w:ind w:left="720" w:hanging="720"/>
+        <w:rPr>
+          <w:color w:val="000000" w:themeColor="text1"/>
+          <w:sz w:val="24"/>
+          <w:szCs w:val="24"/>
+        </w:rPr>
+      </w:pPr>
+      <w:r>
+        <w:rPr>
+          <w:b/>
+          <w:bCs/>
+          <w:color w:val="000000" w:themeColor="text1"/>
+          <w:sz w:val="24"/>
+          <w:szCs w:val="24"/>
+        </w:rPr>
+        <w:t>Pozzi, T.</w:t>
+      </w:r>
+      <w:r>
+        <w:rPr>
+          <w:color w:val="000000" w:themeColor="text1"/>
+          <w:sz w:val="24"/>
+          <w:szCs w:val="24"/>
+        </w:rPr>
+        <w:t xml:space="preserve">, </w:t>
+      </w:r>
+      <w:r>
+        <w:rPr>
+          <w:color w:val="000000" w:themeColor="text1"/>
+          <w:sz w:val="24"/>
+          <w:szCs w:val="24"/>
+        </w:rPr>
+        <w:t xml:space="preserve">Scheetz, E., Heikkila, H., </w:t>
+      </w:r>
+      <w:r>
+        <w:rPr>
+          <w:color w:val="000000" w:themeColor="text1"/>
+          <w:sz w:val="24"/>
+          <w:szCs w:val="24"/>
+        </w:rPr>
+        <w:t>Lubell, M.</w:t>
+      </w:r>
+      <w:r>
+        <w:rPr>
+          <w:color w:val="000000" w:themeColor="text1"/>
+          <w:sz w:val="24"/>
+          <w:szCs w:val="24"/>
+        </w:rPr>
+        <w:t xml:space="preserve">, and Gerlak, A. </w:t>
+      </w:r>
+      <w:r>
+        <w:rPr>
+          <w:color w:val="000000" w:themeColor="text1"/>
+          <w:sz w:val="24"/>
+          <w:szCs w:val="24"/>
+        </w:rPr>
+        <w:t>(202</w:t>
+      </w:r>
+      <w:r>
+        <w:rPr>
+          <w:color w:val="000000" w:themeColor="text1"/>
+          <w:sz w:val="24"/>
+          <w:szCs w:val="24"/>
+        </w:rPr>
+        <w:t>6</w:t>
+      </w:r>
+      <w:r>
+        <w:rPr>
+          <w:color w:val="000000" w:themeColor="text1"/>
+          <w:sz w:val="24"/>
+          <w:szCs w:val="24"/>
+        </w:rPr>
+        <w:t>) “</w:t>
+      </w:r>
+      <w:r>
+        <w:rPr>
+          <w:color w:val="000000" w:themeColor="text1"/>
+          <w:sz w:val="24"/>
+          <w:szCs w:val="24"/>
+        </w:rPr>
+        <w:t>Learning to Agree: Insights from the California’s Delta Science Enterprise.</w:t>
+      </w:r>
+      <w:r>
+        <w:rPr>
+          <w:color w:val="000000" w:themeColor="text1"/>
+          <w:sz w:val="24"/>
+          <w:szCs w:val="24"/>
+        </w:rPr>
+        <w:t xml:space="preserve">” </w:t>
+      </w:r>
+      <w:r>
+        <w:rPr>
+          <w:color w:val="000000" w:themeColor="text1"/>
+          <w:sz w:val="24"/>
+          <w:szCs w:val="24"/>
+        </w:rPr>
+        <w:t>Conference on Policy Process Research</w:t>
+      </w:r>
+      <w:r>
+        <w:rPr>
+          <w:color w:val="000000" w:themeColor="text1"/>
+          <w:sz w:val="24"/>
+          <w:szCs w:val="24"/>
+        </w:rPr>
+        <w:t xml:space="preserve"> (in-person).</w:t>
+      </w:r>
+    </w:p>
+    <w:p>
+      <w:pPr>
+        <w:ind w:left="720" w:hanging="720"/>
+        <w:rPr>
+          <w:color w:val="000000" w:themeColor="text1"/>
+          <w:sz w:val="24"/>
+          <w:szCs w:val="24"/>
+        </w:rPr>
+      </w:pPr>
+    </w:p>
+    <w:p>
+      <w:pPr>
+        <w:ind w:left="720" w:hanging="720"/>
+        <w:rPr>
+          <w:color w:val="000000" w:themeColor="text1"/>
+          <w:sz w:val="24"/>
+          <w:szCs w:val="24"/>
+        </w:rPr>
+      </w:pPr>
+      <w:r>
+        <w:rPr>
+          <w:b/>
+          <w:bCs/>
+          <w:color w:val="000000" w:themeColor="text1"/>
+          <w:sz w:val="24"/>
+          <w:szCs w:val="24"/>
+        </w:rPr>
+        <w:t>Pozzi, T.</w:t>
+      </w:r>
+      <w:r>
+        <w:rPr>
+          <w:color w:val="000000" w:themeColor="text1"/>
+          <w:sz w:val="24"/>
+          <w:szCs w:val="24"/>
+        </w:rPr>
+        <w:t>, Lubell, M.</w:t>
+      </w:r>
+      <w:r>
+        <w:rPr>
+          <w:color w:val="000000" w:themeColor="text1"/>
+          <w:sz w:val="24"/>
+          <w:szCs w:val="24"/>
+        </w:rPr>
+        <w:t>, and Méndez-Barrientos, L.</w:t>
+      </w:r>
+      <w:r>
+        <w:rPr>
+          <w:color w:val="000000" w:themeColor="text1"/>
+          <w:sz w:val="24"/>
+          <w:szCs w:val="24"/>
+        </w:rPr>
+        <w:t xml:space="preserve"> (202</w:t>
+      </w:r>
+      <w:r>
+        <w:rPr>
+          <w:color w:val="000000" w:themeColor="text1"/>
+          <w:sz w:val="24"/>
+          <w:szCs w:val="24"/>
+        </w:rPr>
+        <w:t>6</w:t>
+      </w:r>
+      <w:r>
+        <w:rPr>
+          <w:color w:val="000000" w:themeColor="text1"/>
+          <w:sz w:val="24"/>
+          <w:szCs w:val="24"/>
+        </w:rPr>
+        <w:t>) “</w:t>
+      </w:r>
+      <w:r>
+        <w:rPr>
+          <w:color w:val="000000" w:themeColor="text1"/>
+          <w:sz w:val="24"/>
+          <w:szCs w:val="24"/>
+        </w:rPr>
+        <w:t>Building Power in Polycentric Governance Systems</w:t>
+      </w:r>
+      <w:r>
+        <w:rPr>
+          <w:color w:val="000000" w:themeColor="text1"/>
+          <w:sz w:val="24"/>
+          <w:szCs w:val="24"/>
+        </w:rPr>
+        <w:t xml:space="preserve">” </w:t>
+      </w:r>
+      <w:r>
+        <w:rPr>
+          <w:color w:val="000000" w:themeColor="text1"/>
+          <w:sz w:val="24"/>
+          <w:szCs w:val="24"/>
+        </w:rPr>
+        <w:t>Conference on Policy Process Research</w:t>
+      </w:r>
+      <w:r>
+        <w:rPr>
+          <w:color w:val="000000" w:themeColor="text1"/>
+          <w:sz w:val="24"/>
+          <w:szCs w:val="24"/>
+        </w:rPr>
+        <w:t xml:space="preserve"> (in-person).</w:t>
+      </w:r>
+    </w:p>
+    <w:p>
+      <w:pPr>
+        <w:ind w:left="720" w:hanging="720"/>
+        <w:rPr>
+          <w:b/>
+          <w:bCs/>
+          <w:color w:val="000000" w:themeColor="text1"/>
+          <w:sz w:val="24"/>
+          <w:szCs w:val="24"/>
+        </w:rPr>
+      </w:pPr>
     </w:p>
     <w:p>
       <w:pPr>
@@ -5318,6 +6293,7 @@
           <w:b/>
           <w:bCs/>
         </w:rPr>
+        <w:lastRenderedPageBreak/>
         <w:t>Pozzi, T.</w:t>
       </w:r>
       <w:r>
@@ -5448,7 +6424,6 @@
           <w:b/>
           <w:bCs/>
         </w:rPr>
-        <w:lastRenderedPageBreak/>
         <w:t>Pozzi, T.</w:t>
       </w:r>
       <w:r>
@@ -5637,7 +6612,7 @@
           </mc:Choice>
           <mc:Fallback>
             <w:pict>
-              <v:shape w14:anchorId="42E00074" id="Straight Arrow Connector 1972032769" o:spid="_x0000_s1026" type="#_x0000_t32" style="position:absolute;margin-left:0;margin-top:13pt;width:532.5pt;height:1pt;z-index:251685888;visibility:visible;mso-wrap-style:square;mso-wrap-distance-left:9pt;mso-wrap-distance-top:0;mso-wrap-distance-right:9pt;mso-wrap-distance-bottom:0;mso-position-horizontal:absolute;mso-position-horizontal-relative:text;mso-position-vertical:absolute;mso-position-vertical-relative:text" o:gfxdata="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" strokecolor="black [3200]">
+              <v:shape w14:anchorId="0D215503" id="Straight Arrow Connector 1972032769" o:spid="_x0000_s1026" type="#_x0000_t32" style="position:absolute;margin-left:0;margin-top:13pt;width:532.5pt;height:1pt;z-index:251685888;visibility:visible;mso-wrap-style:square;mso-wrap-distance-left:9pt;mso-wrap-distance-top:0;mso-wrap-distance-right:9pt;mso-wrap-distance-bottom:0;mso-position-horizontal:absolute;mso-position-horizontal-relative:text;mso-position-vertical:absolute;mso-position-vertical-relative:text" o:gfxdata="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" strokecolor="black [3200]">
                 <v:stroke startarrowwidth="narrow" startarrowlength="short" endarrowwidth="narrow" endarrowlength="short" joinstyle="miter"/>
               </v:shape>
             </w:pict>
@@ -5775,964 +6750,6 @@
         </w:rPr>
         <w:tab/>
         <w:t>Asking Different Questions, UC Davis Feminist Research Institute</w:t>
-      </w:r>
-    </w:p>
-    <w:p>
-      <w:pPr>
-        <w:rPr>
-          <w:bCs/>
-          <w:color w:val="auto"/>
-          <w:sz w:val="24"/>
-          <w:szCs w:val="24"/>
-        </w:rPr>
-      </w:pPr>
-    </w:p>
-    <w:p>
-      <w:pPr>
-        <w:rPr>
-          <w:b/>
-          <w:color w:val="auto"/>
-          <w:sz w:val="24"/>
-          <w:szCs w:val="24"/>
-        </w:rPr>
-      </w:pPr>
-      <w:r>
-        <w:rPr>
-          <w:b/>
-          <w:color w:val="auto"/>
-          <w:sz w:val="24"/>
-          <w:szCs w:val="24"/>
-        </w:rPr>
-        <w:t xml:space="preserve">TEACHING </w:t>
-      </w:r>
-      <w:r>
-        <w:rPr>
-          <w:noProof/>
-          <w:color w:val="auto"/>
-          <w:sz w:val="24"/>
-          <w:szCs w:val="24"/>
-        </w:rPr>
-        <mc:AlternateContent>
-          <mc:Choice Requires="wps">
-            <w:drawing>
-              <wp:anchor distT="0" distB="0" distL="114300" distR="114300" simplePos="0" relativeHeight="251672576" behindDoc="0" locked="0" layoutInCell="1" hidden="0" allowOverlap="1" wp14:anchorId="381B986A" wp14:editId="15B2ED4E">
-                <wp:simplePos x="0" y="0"/>
-                <wp:positionH relativeFrom="column">
-                  <wp:posOffset>1</wp:posOffset>
-                </wp:positionH>
-                <wp:positionV relativeFrom="paragraph">
-                  <wp:posOffset>165100</wp:posOffset>
-                </wp:positionV>
-                <wp:extent cx="6762750" cy="12700"/>
-                <wp:effectExtent l="0" t="0" r="0" b="0"/>
-                <wp:wrapNone/>
-                <wp:docPr id="8" name="Straight Arrow Connector 8"/>
-                <wp:cNvGraphicFramePr/>
-                <a:graphic xmlns:a="http://schemas.openxmlformats.org/drawingml/2006/main">
-                  <a:graphicData uri="http://schemas.microsoft.com/office/word/2010/wordprocessingShape">
-                    <wps:wsp>
-                      <wps:cNvCnPr/>
-                      <wps:spPr>
-                        <a:xfrm>
-                          <a:off x="1964625" y="3780000"/>
-                          <a:ext cx="6762750" cy="0"/>
-                        </a:xfrm>
-                        <a:prstGeom prst="straightConnector1">
-                          <a:avLst/>
-                        </a:prstGeom>
-                        <a:noFill/>
-                        <a:ln w="9525" cap="flat" cmpd="sng">
-                          <a:solidFill>
-                            <a:schemeClr val="dk1"/>
-                          </a:solidFill>
-                          <a:prstDash val="solid"/>
-                          <a:miter lim="800000"/>
-                          <a:headEnd type="none" w="sm" len="sm"/>
-                          <a:tailEnd type="none" w="sm" len="sm"/>
-                        </a:ln>
-                      </wps:spPr>
-                      <wps:bodyPr/>
-                    </wps:wsp>
-                  </a:graphicData>
-                </a:graphic>
-              </wp:anchor>
-            </w:drawing>
-          </mc:Choice>
-          <mc:Fallback>
-            <w:pict>
-              <v:shape w14:anchorId="71581CD1" id="Straight Arrow Connector 8" o:spid="_x0000_s1026" type="#_x0000_t32" style="position:absolute;margin-left:0;margin-top:13pt;width:532.5pt;height:1pt;z-index:251672576;visibility:visible;mso-wrap-style:square;mso-wrap-distance-left:9pt;mso-wrap-distance-top:0;mso-wrap-distance-right:9pt;mso-wrap-distance-bottom:0;mso-position-horizontal:absolute;mso-position-horizontal-relative:text;mso-position-vertical:absolute;mso-position-vertical-relative:text" o:gfxdata="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" strokecolor="black [3200]">
-                <v:stroke startarrowwidth="narrow" startarrowlength="short" endarrowwidth="narrow" endarrowlength="short" joinstyle="miter"/>
-              </v:shape>
-            </w:pict>
-          </mc:Fallback>
-        </mc:AlternateContent>
-      </w:r>
-      <w:r>
-        <w:rPr>
-          <w:b/>
-          <w:color w:val="auto"/>
-          <w:sz w:val="24"/>
-          <w:szCs w:val="24"/>
-        </w:rPr>
-        <w:t xml:space="preserve"> AND MENTORING</w:t>
-      </w:r>
-    </w:p>
-    <w:p>
-      <w:pPr>
-        <w:rPr>
-          <w:bCs/>
-          <w:color w:val="auto"/>
-          <w:sz w:val="24"/>
-          <w:szCs w:val="24"/>
-          <w:u w:val="single"/>
-        </w:rPr>
-      </w:pPr>
-      <w:r>
-        <w:rPr>
-          <w:bCs/>
-          <w:color w:val="auto"/>
-          <w:sz w:val="24"/>
-          <w:szCs w:val="24"/>
-          <w:u w:val="single"/>
-        </w:rPr>
-        <w:t>Teaching</w:t>
-      </w:r>
-    </w:p>
-    <w:p>
-      <w:pPr>
-        <w:rPr>
-          <w:bCs/>
-          <w:color w:val="auto"/>
-          <w:sz w:val="24"/>
-          <w:szCs w:val="24"/>
-        </w:rPr>
-      </w:pPr>
-      <w:r>
-        <w:rPr>
-          <w:bCs/>
-          <w:color w:val="auto"/>
-          <w:sz w:val="24"/>
-          <w:szCs w:val="24"/>
-        </w:rPr>
-        <w:t>2025</w:t>
-      </w:r>
-      <w:r>
-        <w:rPr>
-          <w:bCs/>
-          <w:color w:val="auto"/>
-          <w:sz w:val="24"/>
-          <w:szCs w:val="24"/>
-        </w:rPr>
-        <w:tab/>
-      </w:r>
-      <w:r>
-        <w:rPr>
-          <w:bCs/>
-          <w:color w:val="auto"/>
-          <w:sz w:val="24"/>
-          <w:szCs w:val="24"/>
-        </w:rPr>
-        <w:tab/>
-        <w:t>Teaching assistant. The Policy Process, UC Davis.</w:t>
-      </w:r>
-    </w:p>
-    <w:p>
-      <w:pPr>
-        <w:rPr>
-          <w:bCs/>
-          <w:color w:val="auto"/>
-          <w:sz w:val="24"/>
-          <w:szCs w:val="24"/>
-        </w:rPr>
-      </w:pPr>
-      <w:r>
-        <w:rPr>
-          <w:bCs/>
-          <w:color w:val="auto"/>
-          <w:sz w:val="24"/>
-          <w:szCs w:val="24"/>
-        </w:rPr>
-        <w:t>2025</w:t>
-      </w:r>
-      <w:r>
-        <w:rPr>
-          <w:bCs/>
-          <w:color w:val="auto"/>
-          <w:sz w:val="24"/>
-          <w:szCs w:val="24"/>
-        </w:rPr>
-        <w:tab/>
-      </w:r>
-      <w:r>
-        <w:rPr>
-          <w:bCs/>
-          <w:color w:val="auto"/>
-          <w:sz w:val="24"/>
-          <w:szCs w:val="24"/>
-        </w:rPr>
-        <w:tab/>
-        <w:t>Teaching assistant. Environmental Governance, UC Davis.</w:t>
-      </w:r>
-    </w:p>
-    <w:p>
-      <w:pPr>
-        <w:rPr>
-          <w:bCs/>
-          <w:color w:val="auto"/>
-          <w:sz w:val="24"/>
-          <w:szCs w:val="24"/>
-        </w:rPr>
-      </w:pPr>
-      <w:r>
-        <w:rPr>
-          <w:bCs/>
-          <w:color w:val="auto"/>
-          <w:sz w:val="24"/>
-          <w:szCs w:val="24"/>
-        </w:rPr>
-        <w:t>2022</w:t>
-      </w:r>
-      <w:r>
-        <w:rPr>
-          <w:bCs/>
-          <w:color w:val="auto"/>
-          <w:sz w:val="24"/>
-          <w:szCs w:val="24"/>
-        </w:rPr>
-        <w:t>, 2024</w:t>
-      </w:r>
-      <w:r>
-        <w:rPr>
-          <w:bCs/>
-          <w:color w:val="auto"/>
-          <w:sz w:val="24"/>
-          <w:szCs w:val="24"/>
-        </w:rPr>
-        <w:tab/>
-        <w:t>Instructor. R</w:t>
-      </w:r>
-      <w:r>
-        <w:rPr>
-          <w:bCs/>
-          <w:color w:val="auto"/>
-          <w:sz w:val="24"/>
-          <w:szCs w:val="24"/>
-        </w:rPr>
-        <w:t xml:space="preserve"> Data Analysis and Visualization (R-DAVIS)</w:t>
-      </w:r>
-      <w:r>
-        <w:rPr>
-          <w:bCs/>
-          <w:color w:val="auto"/>
-          <w:sz w:val="24"/>
-          <w:szCs w:val="24"/>
-        </w:rPr>
-        <w:t>, UC Davis</w:t>
-      </w:r>
-    </w:p>
-    <w:p>
-      <w:pPr>
-        <w:rPr>
-          <w:bCs/>
-          <w:color w:val="auto"/>
-          <w:sz w:val="24"/>
-          <w:szCs w:val="24"/>
-        </w:rPr>
-      </w:pPr>
-      <w:r>
-        <w:rPr>
-          <w:bCs/>
-          <w:color w:val="auto"/>
-          <w:sz w:val="24"/>
-          <w:szCs w:val="24"/>
-        </w:rPr>
-        <w:t xml:space="preserve">2021 </w:t>
-      </w:r>
-      <w:r>
-        <w:rPr>
-          <w:bCs/>
-          <w:color w:val="auto"/>
-          <w:sz w:val="24"/>
-          <w:szCs w:val="24"/>
-        </w:rPr>
-        <w:tab/>
-      </w:r>
-      <w:r>
-        <w:rPr>
-          <w:bCs/>
-          <w:color w:val="auto"/>
-          <w:sz w:val="24"/>
-          <w:szCs w:val="24"/>
-        </w:rPr>
-        <w:tab/>
-      </w:r>
-      <w:r>
-        <w:rPr>
-          <w:bCs/>
-          <w:color w:val="auto"/>
-          <w:sz w:val="24"/>
-          <w:szCs w:val="24"/>
-        </w:rPr>
-        <w:t>Grader</w:t>
-      </w:r>
-      <w:r>
-        <w:rPr>
-          <w:bCs/>
-          <w:color w:val="auto"/>
-          <w:sz w:val="24"/>
-          <w:szCs w:val="24"/>
-        </w:rPr>
-        <w:t>. Public Land</w:t>
-      </w:r>
-      <w:r>
-        <w:rPr>
-          <w:bCs/>
-          <w:color w:val="auto"/>
-          <w:sz w:val="24"/>
-          <w:szCs w:val="24"/>
-        </w:rPr>
-        <w:t>s</w:t>
-      </w:r>
-      <w:r>
-        <w:rPr>
-          <w:bCs/>
-          <w:color w:val="auto"/>
-          <w:sz w:val="24"/>
-          <w:szCs w:val="24"/>
-        </w:rPr>
-        <w:t xml:space="preserve"> Governance, UC Davis. </w:t>
-      </w:r>
-    </w:p>
-    <w:p>
-      <w:pPr>
-        <w:rPr>
-          <w:bCs/>
-          <w:color w:val="auto"/>
-          <w:sz w:val="24"/>
-          <w:szCs w:val="24"/>
-        </w:rPr>
-      </w:pPr>
-    </w:p>
-    <w:p>
-      <w:pPr>
-        <w:rPr>
-          <w:bCs/>
-          <w:color w:val="auto"/>
-          <w:sz w:val="24"/>
-          <w:szCs w:val="24"/>
-          <w:u w:val="single"/>
-        </w:rPr>
-      </w:pPr>
-      <w:r>
-        <w:rPr>
-          <w:bCs/>
-          <w:color w:val="auto"/>
-          <w:sz w:val="24"/>
-          <w:szCs w:val="24"/>
-          <w:u w:val="single"/>
-        </w:rPr>
-        <w:t>Guest Lecture</w:t>
-      </w:r>
-    </w:p>
-    <w:p>
-      <w:pPr>
-        <w:rPr>
-          <w:bCs/>
-          <w:color w:val="auto"/>
-          <w:sz w:val="24"/>
-          <w:szCs w:val="24"/>
-        </w:rPr>
-      </w:pPr>
-      <w:r>
-        <w:rPr>
-          <w:bCs/>
-          <w:color w:val="auto"/>
-          <w:sz w:val="24"/>
-          <w:szCs w:val="24"/>
-        </w:rPr>
-        <w:t xml:space="preserve">2024 </w:t>
-      </w:r>
-      <w:r>
-        <w:rPr>
-          <w:bCs/>
-          <w:color w:val="auto"/>
-          <w:sz w:val="24"/>
-          <w:szCs w:val="24"/>
-        </w:rPr>
-        <w:tab/>
-      </w:r>
-      <w:r>
-        <w:rPr>
-          <w:bCs/>
-          <w:color w:val="auto"/>
-          <w:sz w:val="24"/>
-          <w:szCs w:val="24"/>
-        </w:rPr>
-        <w:tab/>
-        <w:t>Lecture titled “</w:t>
-      </w:r>
-      <w:r>
-        <w:rPr>
-          <w:color w:val="auto"/>
-          <w:sz w:val="24"/>
-          <w:szCs w:val="24"/>
-        </w:rPr>
-        <w:t>Collaboration and Equity in Environmental Governance and Policy</w:t>
-      </w:r>
-      <w:r>
-        <w:rPr>
-          <w:color w:val="auto"/>
-          <w:sz w:val="24"/>
-          <w:szCs w:val="24"/>
-        </w:rPr>
-        <w:t>.”</w:t>
-      </w:r>
-    </w:p>
-    <w:p>
-      <w:pPr>
-        <w:ind w:left="2160" w:hanging="720"/>
-        <w:rPr>
-          <w:bCs/>
-          <w:color w:val="auto"/>
-          <w:sz w:val="24"/>
-          <w:szCs w:val="24"/>
-        </w:rPr>
-      </w:pPr>
-      <w:r>
-        <w:rPr>
-          <w:bCs/>
-          <w:color w:val="auto"/>
-          <w:sz w:val="24"/>
-          <w:szCs w:val="24"/>
-        </w:rPr>
-        <w:t>Guest lecture for a class on Principles of Ecology at American River College (Sacramento, CA).</w:t>
-      </w:r>
-    </w:p>
-    <w:p>
-      <w:pPr>
-        <w:rPr>
-          <w:bCs/>
-          <w:color w:val="auto"/>
-          <w:sz w:val="24"/>
-          <w:szCs w:val="24"/>
-        </w:rPr>
-      </w:pPr>
-    </w:p>
-    <w:p>
-      <w:pPr>
-        <w:rPr>
-          <w:bCs/>
-          <w:color w:val="auto"/>
-          <w:sz w:val="24"/>
-          <w:szCs w:val="24"/>
-        </w:rPr>
-      </w:pPr>
-      <w:r>
-        <w:rPr>
-          <w:bCs/>
-          <w:color w:val="auto"/>
-          <w:sz w:val="24"/>
-          <w:szCs w:val="24"/>
-        </w:rPr>
-        <w:t>2023</w:t>
-      </w:r>
-      <w:r>
-        <w:rPr>
-          <w:bCs/>
-          <w:color w:val="auto"/>
-          <w:sz w:val="24"/>
-          <w:szCs w:val="24"/>
-        </w:rPr>
-        <w:tab/>
-      </w:r>
-      <w:r>
-        <w:rPr>
-          <w:bCs/>
-          <w:color w:val="auto"/>
-          <w:sz w:val="24"/>
-          <w:szCs w:val="24"/>
-        </w:rPr>
-        <w:tab/>
-        <w:t>Lecture titled “Power and Equity in Environmental Governance: A Case Study in the California</w:t>
-      </w:r>
-    </w:p>
-    <w:p>
-      <w:pPr>
-        <w:ind w:left="2160" w:hanging="720"/>
-        <w:rPr>
-          <w:bCs/>
-          <w:color w:val="auto"/>
-          <w:sz w:val="24"/>
-          <w:szCs w:val="24"/>
-        </w:rPr>
-      </w:pPr>
-      <w:r>
-        <w:rPr>
-          <w:bCs/>
-          <w:color w:val="auto"/>
-          <w:sz w:val="24"/>
-          <w:szCs w:val="24"/>
-        </w:rPr>
-        <w:t>Delta.” Guest lecture for a class on EJ and Resilience at BOKU University (Vienna, Austria).</w:t>
-      </w:r>
-    </w:p>
-    <w:p>
-      <w:pPr>
-        <w:rPr>
-          <w:bCs/>
-          <w:color w:val="auto"/>
-          <w:sz w:val="24"/>
-          <w:szCs w:val="24"/>
-        </w:rPr>
-      </w:pPr>
-    </w:p>
-    <w:p>
-      <w:pPr>
-        <w:rPr>
-          <w:bCs/>
-          <w:color w:val="auto"/>
-          <w:sz w:val="24"/>
-          <w:szCs w:val="24"/>
-          <w:u w:val="single"/>
-        </w:rPr>
-      </w:pPr>
-      <w:r>
-        <w:rPr>
-          <w:bCs/>
-          <w:color w:val="auto"/>
-          <w:sz w:val="24"/>
-          <w:szCs w:val="24"/>
-          <w:u w:val="single"/>
-        </w:rPr>
-        <w:t>Undergraduate Interns</w:t>
-      </w:r>
-    </w:p>
-    <w:p>
-      <w:pPr>
-        <w:rPr>
-          <w:bCs/>
-          <w:color w:val="auto"/>
-          <w:sz w:val="24"/>
-          <w:szCs w:val="24"/>
-        </w:rPr>
-      </w:pPr>
-      <w:r>
-        <w:rPr>
-          <w:bCs/>
-          <w:color w:val="auto"/>
-          <w:sz w:val="24"/>
-          <w:szCs w:val="24"/>
-        </w:rPr>
-        <w:t xml:space="preserve">2024 - </w:t>
-      </w:r>
-      <w:r>
-        <w:rPr>
-          <w:bCs/>
-          <w:color w:val="auto"/>
-          <w:sz w:val="24"/>
-          <w:szCs w:val="24"/>
-        </w:rPr>
-        <w:t>2025</w:t>
-      </w:r>
-      <w:r>
-        <w:rPr>
-          <w:bCs/>
-          <w:color w:val="auto"/>
-          <w:sz w:val="24"/>
-          <w:szCs w:val="24"/>
-        </w:rPr>
-        <w:t xml:space="preserve"> </w:t>
-      </w:r>
-      <w:r>
-        <w:rPr>
-          <w:bCs/>
-          <w:color w:val="auto"/>
-          <w:sz w:val="24"/>
-          <w:szCs w:val="24"/>
-        </w:rPr>
-        <w:tab/>
-      </w:r>
-      <w:r>
-        <w:rPr>
-          <w:bCs/>
-          <w:color w:val="auto"/>
-          <w:sz w:val="24"/>
-          <w:szCs w:val="24"/>
-        </w:rPr>
-        <w:t xml:space="preserve">Isabella Gonzales (BS </w:t>
-      </w:r>
-      <w:r>
-        <w:rPr>
-          <w:bCs/>
-          <w:color w:val="auto"/>
-          <w:sz w:val="24"/>
-          <w:szCs w:val="24"/>
-        </w:rPr>
-        <w:t>Environmental Science and Policy</w:t>
-      </w:r>
-      <w:r>
-        <w:rPr>
-          <w:bCs/>
-          <w:color w:val="auto"/>
-          <w:sz w:val="24"/>
-          <w:szCs w:val="24"/>
-        </w:rPr>
-        <w:t xml:space="preserve"> 2025)</w:t>
-      </w:r>
-    </w:p>
-    <w:p>
-      <w:pPr>
-        <w:rPr>
-          <w:bCs/>
-          <w:color w:val="auto"/>
-          <w:sz w:val="24"/>
-          <w:szCs w:val="24"/>
-        </w:rPr>
-      </w:pPr>
-      <w:r>
-        <w:rPr>
-          <w:bCs/>
-          <w:color w:val="auto"/>
-          <w:sz w:val="24"/>
-          <w:szCs w:val="24"/>
-        </w:rPr>
-        <w:t xml:space="preserve">2024 - </w:t>
-      </w:r>
-      <w:r>
-        <w:rPr>
-          <w:bCs/>
-          <w:color w:val="auto"/>
-          <w:sz w:val="24"/>
-          <w:szCs w:val="24"/>
-        </w:rPr>
-        <w:t>2025</w:t>
-      </w:r>
-      <w:r>
-        <w:rPr>
-          <w:bCs/>
-          <w:color w:val="auto"/>
-          <w:sz w:val="24"/>
-          <w:szCs w:val="24"/>
-        </w:rPr>
-        <w:t xml:space="preserve"> </w:t>
-      </w:r>
-      <w:r>
-        <w:rPr>
-          <w:bCs/>
-          <w:color w:val="auto"/>
-          <w:sz w:val="24"/>
-          <w:szCs w:val="24"/>
-        </w:rPr>
-        <w:tab/>
-      </w:r>
-      <w:r>
-        <w:rPr>
-          <w:bCs/>
-          <w:color w:val="auto"/>
-          <w:sz w:val="24"/>
-          <w:szCs w:val="24"/>
-        </w:rPr>
-        <w:t xml:space="preserve">Nicholas Dunagan (BS </w:t>
-      </w:r>
-      <w:r>
-        <w:rPr>
-          <w:bCs/>
-          <w:color w:val="auto"/>
-          <w:sz w:val="24"/>
-          <w:szCs w:val="24"/>
-        </w:rPr>
-        <w:t>Environmental Science and Policy</w:t>
-      </w:r>
-      <w:r>
-        <w:rPr>
-          <w:bCs/>
-          <w:color w:val="auto"/>
-          <w:sz w:val="24"/>
-          <w:szCs w:val="24"/>
-        </w:rPr>
-        <w:t xml:space="preserve"> 2025)</w:t>
-      </w:r>
-    </w:p>
-    <w:p>
-      <w:pPr>
-        <w:rPr>
-          <w:bCs/>
-          <w:color w:val="auto"/>
-          <w:sz w:val="24"/>
-          <w:szCs w:val="24"/>
-        </w:rPr>
-      </w:pPr>
-      <w:r>
-        <w:rPr>
-          <w:bCs/>
-          <w:color w:val="auto"/>
-          <w:sz w:val="24"/>
-          <w:szCs w:val="24"/>
-        </w:rPr>
-        <w:t>2024</w:t>
-      </w:r>
-      <w:r>
-        <w:rPr>
-          <w:bCs/>
-          <w:color w:val="auto"/>
-          <w:sz w:val="24"/>
-          <w:szCs w:val="24"/>
-        </w:rPr>
-        <w:tab/>
-      </w:r>
-      <w:r>
-        <w:rPr>
-          <w:bCs/>
-          <w:color w:val="auto"/>
-          <w:sz w:val="24"/>
-          <w:szCs w:val="24"/>
-        </w:rPr>
-        <w:tab/>
-        <w:t>Emma Mele (BS Environmental Science and Policy 2024).</w:t>
-      </w:r>
-    </w:p>
-    <w:p>
-      <w:pPr>
-        <w:rPr>
-          <w:bCs/>
-          <w:color w:val="auto"/>
-          <w:sz w:val="24"/>
-          <w:szCs w:val="24"/>
-        </w:rPr>
-      </w:pPr>
-      <w:r>
-        <w:rPr>
-          <w:bCs/>
-          <w:color w:val="auto"/>
-          <w:sz w:val="24"/>
-          <w:szCs w:val="24"/>
-        </w:rPr>
-        <w:t xml:space="preserve">2023 - </w:t>
-      </w:r>
-      <w:r>
-        <w:rPr>
-          <w:bCs/>
-          <w:color w:val="auto"/>
-          <w:sz w:val="24"/>
-          <w:szCs w:val="24"/>
-        </w:rPr>
-        <w:t>2025</w:t>
-      </w:r>
-      <w:r>
-        <w:rPr>
-          <w:bCs/>
-          <w:color w:val="auto"/>
-          <w:sz w:val="24"/>
-          <w:szCs w:val="24"/>
-        </w:rPr>
-        <w:tab/>
-        <w:t>Toby Jacob (BS Environmental Science and Policy 2027).</w:t>
-      </w:r>
-    </w:p>
-    <w:p>
-      <w:pPr>
-        <w:rPr>
-          <w:bCs/>
-          <w:color w:val="auto"/>
-          <w:sz w:val="24"/>
-          <w:szCs w:val="24"/>
-        </w:rPr>
-      </w:pPr>
-      <w:r>
-        <w:rPr>
-          <w:bCs/>
-          <w:color w:val="auto"/>
-          <w:sz w:val="24"/>
-          <w:szCs w:val="24"/>
-        </w:rPr>
-        <w:t>2023</w:t>
-      </w:r>
-      <w:r>
-        <w:rPr>
-          <w:bCs/>
-          <w:color w:val="auto"/>
-          <w:sz w:val="24"/>
-          <w:szCs w:val="24"/>
-        </w:rPr>
-        <w:t xml:space="preserve"> - </w:t>
-      </w:r>
-      <w:r>
-        <w:rPr>
-          <w:bCs/>
-          <w:color w:val="auto"/>
-          <w:sz w:val="24"/>
-          <w:szCs w:val="24"/>
-        </w:rPr>
-        <w:t>2025</w:t>
-      </w:r>
-      <w:r>
-        <w:rPr>
-          <w:bCs/>
-          <w:color w:val="auto"/>
-          <w:sz w:val="24"/>
-          <w:szCs w:val="24"/>
-        </w:rPr>
-        <w:tab/>
-        <w:t xml:space="preserve">Emily Denio (BS Environmental </w:t>
-      </w:r>
-      <w:r>
-        <w:rPr>
-          <w:bCs/>
-          <w:color w:val="auto"/>
-          <w:sz w:val="24"/>
-          <w:szCs w:val="24"/>
-        </w:rPr>
-        <w:t>Policy</w:t>
-      </w:r>
-      <w:r>
-        <w:rPr>
-          <w:bCs/>
-          <w:color w:val="auto"/>
-          <w:sz w:val="24"/>
-          <w:szCs w:val="24"/>
-        </w:rPr>
-        <w:t xml:space="preserve"> and </w:t>
-      </w:r>
-      <w:r>
-        <w:rPr>
-          <w:bCs/>
-          <w:color w:val="auto"/>
-          <w:sz w:val="24"/>
-          <w:szCs w:val="24"/>
-        </w:rPr>
-        <w:t>Planning</w:t>
-      </w:r>
-      <w:r>
-        <w:rPr>
-          <w:bCs/>
-          <w:color w:val="auto"/>
-          <w:sz w:val="24"/>
-          <w:szCs w:val="24"/>
-        </w:rPr>
-        <w:t xml:space="preserve"> 2025).</w:t>
-      </w:r>
-    </w:p>
-    <w:p>
-      <w:pPr>
-        <w:rPr>
-          <w:bCs/>
-          <w:color w:val="auto"/>
-          <w:sz w:val="24"/>
-          <w:szCs w:val="24"/>
-        </w:rPr>
-      </w:pPr>
-      <w:r>
-        <w:rPr>
-          <w:bCs/>
-          <w:color w:val="auto"/>
-          <w:sz w:val="24"/>
-          <w:szCs w:val="24"/>
-        </w:rPr>
-        <w:t>2023</w:t>
-      </w:r>
-      <w:r>
-        <w:rPr>
-          <w:bCs/>
-          <w:color w:val="auto"/>
-          <w:sz w:val="24"/>
-          <w:szCs w:val="24"/>
-        </w:rPr>
-        <w:tab/>
-      </w:r>
-      <w:r>
-        <w:rPr>
-          <w:bCs/>
-          <w:color w:val="auto"/>
-          <w:sz w:val="24"/>
-          <w:szCs w:val="24"/>
-        </w:rPr>
-        <w:tab/>
-        <w:t>Eden Winniford (BS Environmental Science and Policy 2023).</w:t>
-      </w:r>
-    </w:p>
-    <w:p>
-      <w:pPr>
-        <w:rPr>
-          <w:bCs/>
-          <w:color w:val="auto"/>
-          <w:sz w:val="24"/>
-          <w:szCs w:val="24"/>
-        </w:rPr>
-      </w:pPr>
-      <w:r>
-        <w:rPr>
-          <w:bCs/>
-          <w:color w:val="auto"/>
-          <w:sz w:val="24"/>
-          <w:szCs w:val="24"/>
-        </w:rPr>
-        <w:t>2022</w:t>
-      </w:r>
-      <w:r>
-        <w:rPr>
-          <w:bCs/>
-          <w:color w:val="auto"/>
-          <w:sz w:val="24"/>
-          <w:szCs w:val="24"/>
-        </w:rPr>
-        <w:t xml:space="preserve"> - 2023</w:t>
-      </w:r>
-      <w:r>
-        <w:rPr>
-          <w:bCs/>
-          <w:color w:val="auto"/>
-          <w:sz w:val="24"/>
-          <w:szCs w:val="24"/>
-        </w:rPr>
-        <w:tab/>
-        <w:t>Elaina Legg (BS Communication and Psychology 2023)</w:t>
-      </w:r>
-      <w:r>
-        <w:rPr>
-          <w:bCs/>
-          <w:color w:val="auto"/>
-          <w:sz w:val="24"/>
-          <w:szCs w:val="24"/>
-        </w:rPr>
-        <w:t xml:space="preserve">. </w:t>
-      </w:r>
-    </w:p>
-    <w:p>
-      <w:pPr>
-        <w:rPr>
-          <w:bCs/>
-          <w:color w:val="auto"/>
-          <w:sz w:val="24"/>
-          <w:szCs w:val="24"/>
-        </w:rPr>
-      </w:pPr>
-      <w:r>
-        <w:rPr>
-          <w:bCs/>
-          <w:color w:val="auto"/>
-          <w:sz w:val="24"/>
-          <w:szCs w:val="24"/>
-        </w:rPr>
-        <w:t>2020</w:t>
-      </w:r>
-      <w:r>
-        <w:rPr>
-          <w:bCs/>
-          <w:color w:val="auto"/>
-          <w:sz w:val="24"/>
-          <w:szCs w:val="24"/>
-        </w:rPr>
-        <w:tab/>
-      </w:r>
-      <w:r>
-        <w:rPr>
-          <w:bCs/>
-          <w:color w:val="auto"/>
-          <w:sz w:val="24"/>
-          <w:szCs w:val="24"/>
-        </w:rPr>
-        <w:tab/>
-        <w:t xml:space="preserve">Graduate student mentor. Vertically Integrated Project, Boise State University. </w:t>
       </w:r>
     </w:p>
     <w:p>
@@ -6841,7 +6858,7 @@
           </mc:Choice>
           <mc:Fallback>
             <w:pict>
-              <v:shape w14:anchorId="5B365113" id="Straight Arrow Connector 1" o:spid="_x0000_s1026" type="#_x0000_t32" style="position:absolute;margin-left:0;margin-top:13pt;width:532.5pt;height:1pt;z-index:251683840;visibility:visible;mso-wrap-style:square;mso-wrap-distance-left:9pt;mso-wrap-distance-top:0;mso-wrap-distance-right:9pt;mso-wrap-distance-bottom:0;mso-position-horizontal:absolute;mso-position-horizontal-relative:text;mso-position-vertical:absolute;mso-position-vertical-relative:text" o:gfxdata="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" strokecolor="black [3200]">
+              <v:shape w14:anchorId="15171DDA" id="Straight Arrow Connector 1" o:spid="_x0000_s1026" type="#_x0000_t32" style="position:absolute;margin-left:0;margin-top:13pt;width:532.5pt;height:1pt;z-index:251683840;visibility:visible;mso-wrap-style:square;mso-wrap-distance-left:9pt;mso-wrap-distance-top:0;mso-wrap-distance-right:9pt;mso-wrap-distance-bottom:0;mso-position-horizontal:absolute;mso-position-horizontal-relative:text;mso-position-vertical:absolute;mso-position-vertical-relative:text" o:gfxdata="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" strokecolor="black [3200]">
                 <v:stroke startarrowwidth="narrow" startarrowlength="short" endarrowwidth="narrow" endarrowlength="short" joinstyle="miter"/>
               </v:shape>
             </w:pict>
@@ -6997,7 +7014,6 @@
         <w:rPr>
           <w:rFonts w:ascii="Calibri" w:hAnsi="Calibri" w:cs="Calibri"/>
         </w:rPr>
-        <w:lastRenderedPageBreak/>
         <w:t>2021 Weather-ready research instrument and data publication by the Natural Hazards Center - $2,500</w:t>
       </w:r>
     </w:p>
@@ -7079,7 +7095,7 @@
           </mc:Choice>
           <mc:Fallback>
             <w:pict>
-              <v:shape w14:anchorId="31B03F78" id="Straight Arrow Connector 17" o:spid="_x0000_s1026" type="#_x0000_t32" style="position:absolute;margin-left:1pt;margin-top:13pt;width:532.5pt;height:1pt;z-index:251676672;visibility:visible;mso-wrap-style:square;mso-wrap-distance-left:9pt;mso-wrap-distance-top:0;mso-wrap-distance-right:9pt;mso-wrap-distance-bottom:0;mso-position-horizontal:absolute;mso-position-horizontal-relative:text;mso-position-vertical:absolute;mso-position-vertical-relative:text" o:gfxdata="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" strokecolor="black [3200]">
+              <v:shape w14:anchorId="5BEA1D37" id="Straight Arrow Connector 17" o:spid="_x0000_s1026" type="#_x0000_t32" style="position:absolute;margin-left:1pt;margin-top:13pt;width:532.5pt;height:1pt;z-index:251676672;visibility:visible;mso-wrap-style:square;mso-wrap-distance-left:9pt;mso-wrap-distance-top:0;mso-wrap-distance-right:9pt;mso-wrap-distance-bottom:0;mso-position-horizontal:absolute;mso-position-horizontal-relative:text;mso-position-vertical:absolute;mso-position-vertical-relative:text" o:gfxdata="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" strokecolor="black [3200]">
                 <v:stroke startarrowwidth="narrow" startarrowlength="short" endarrowwidth="narrow" endarrowlength="short" joinstyle="miter"/>
               </v:shape>
             </w:pict>
@@ -7230,7 +7246,7 @@
           </mc:Choice>
           <mc:Fallback>
             <w:pict>
-              <v:shape w14:anchorId="2353DB8D" id="Straight Arrow Connector 18" o:spid="_x0000_s1026" type="#_x0000_t32" style="position:absolute;margin-left:1pt;margin-top:13pt;width:532.5pt;height:1pt;z-index:251677696;visibility:visible;mso-wrap-style:square;mso-wrap-distance-left:9pt;mso-wrap-distance-top:0;mso-wrap-distance-right:9pt;mso-wrap-distance-bottom:0;mso-position-horizontal:absolute;mso-position-horizontal-relative:text;mso-position-vertical:absolute;mso-position-vertical-relative:text" o:gfxdata="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" strokecolor="black [3200]">
+              <v:shape w14:anchorId="1EEF33F8" id="Straight Arrow Connector 18" o:spid="_x0000_s1026" type="#_x0000_t32" style="position:absolute;margin-left:1pt;margin-top:13pt;width:532.5pt;height:1pt;z-index:251677696;visibility:visible;mso-wrap-style:square;mso-wrap-distance-left:9pt;mso-wrap-distance-top:0;mso-wrap-distance-right:9pt;mso-wrap-distance-bottom:0;mso-position-horizontal:absolute;mso-position-horizontal-relative:text;mso-position-vertical:absolute;mso-position-vertical-relative:text" o:gfxdata="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" strokecolor="black [3200]">
                 <v:stroke startarrowwidth="narrow" startarrowlength="short" endarrowwidth="narrow" endarrowlength="short" joinstyle="miter"/>
               </v:shape>
             </w:pict>
@@ -7319,6 +7335,7 @@
           <w:sz w:val="24"/>
           <w:szCs w:val="24"/>
         </w:rPr>
+        <w:lastRenderedPageBreak/>
         <w:t>2023 - Present</w:t>
       </w:r>
       <w:r>
@@ -7445,9 +7462,8 @@
       </w:r>
     </w:p>
     <w:sectPr>
-      <w:headerReference w:type="default" r:id="rId23"/>
-      <w:footerReference w:type="even" r:id="rId24"/>
-      <w:footerReference w:type="default" r:id="rId25"/>
+      <w:footerReference w:type="even" r:id="rId19"/>
+      <w:footerReference w:type="default" r:id="rId20"/>
       <w:pgSz w:w="12240" w:h="15840"/>
       <w:pgMar w:top="720" w:right="720" w:bottom="720" w:left="720" w:header="720" w:footer="720" w:gutter="0"/>
       <w:pgNumType w:start="1"/>
@@ -7596,7 +7612,7 @@
           <w:rPr>
             <w:rStyle w:val="PageNumber"/>
           </w:rPr>
-          <w:t>7</w:t>
+          <w:t>6</w:t>
         </w:r>
         <w:r>
           <w:rPr>
@@ -7632,31 +7648,6 @@
     </w:p>
   </w:footnote>
 </w:footnotes>
-</file>
-
-<file path=word/header1.xml><?xml version="1.0" encoding="utf-8"?>
-<w:hdr xmlns:wpc="http://schemas.microsoft.com/office/word/2010/wordprocessingCanvas" xmlns:cx="http://schemas.microsoft.com/office/drawing/2014/chartex" xmlns:cx1="http://schemas.microsoft.com/office/drawing/2015/9/8/chartex" xmlns:cx2="http://schemas.microsoft.com/office/drawing/2015/10/21/chartex" xmlns:cx3="http://schemas.microsoft.com/office/drawing/2016/5/9/chartex" xmlns:cx4="http://schemas.microsoft.com/office/drawing/2016/5/10/chartex" xmlns:cx5="http://schemas.microsoft.com/office/drawing/2016/5/11/chartex" xmlns:cx6="http://schemas.microsoft.com/office/drawing/2016/5/12/chartex" xmlns:cx7="http://schemas.microsoft.com/office/drawing/2016/5/13/chartex" xmlns:cx8="http://schemas.microsoft.com/office/drawing/2016/5/14/chartex" xmlns:mc="http://schemas.openxmlformats.org/markup-compatibility/2006" xmlns:aink="http://schemas.microsoft.com/office/drawing/2016/ink" xmlns:am3d="http://schemas.microsoft.com/office/drawing/2017/model3d" xmlns:o="urn:schemas-microsoft-com:office:office" xmlns:oel="http://schemas.microsoft.com/office/2019/extlst" xmlns:r="http://schemas.openxmlformats.org/officeDocument/2006/relationships" xmlns:m="http://schemas.openxmlformats.org/officeDocument/2006/math" xmlns:v="urn:schemas-microsoft-com:vml" xmlns:wp14="http://schemas.microsoft.com/office/word/2010/wordprocessingDrawing" xmlns:wp="http://schemas.openxmlformats.org/drawingml/2006/wordprocessingDrawing" xmlns:w10="urn:schemas-microsoft-com:office:word" xmlns:w="http://schemas.openxmlformats.org/wordprocessingml/2006/main" xmlns:w14="http://schemas.microsoft.com/office/word/2010/wordml" xmlns:w15="http://schemas.microsoft.com/office/word/2012/wordml" xmlns:w16cex="http://schemas.microsoft.com/office/word/2018/wordml/cex" xmlns:w16cid="http://schemas.microsoft.com/office/word/2016/wordml/cid" xmlns:w16="http://schemas.microsoft.com/office/word/2018/wordml" xmlns:w16du="http://schemas.microsoft.com/office/word/2023/wordml/word16du" xmlns:w16sdtdh="http://schemas.microsoft.com/office/word/2020/wordml/sdtdatahash" xmlns:w16sdtfl="http://schemas.microsoft.com/office/word/2024/wordml/sdtformatlock" xmlns:w16se="http://schemas.microsoft.com/office/word/2015/wordml/symex" xmlns:wpg="http://schemas.microsoft.com/office/word/2010/wordprocessingGroup" xmlns:wpi="http://schemas.microsoft.com/office/word/2010/wordprocessingInk" xmlns:wne="http://schemas.microsoft.com/office/word/2006/wordml" xmlns:wps="http://schemas.microsoft.com/office/word/2010/wordprocessingShape" mc:Ignorable="w14 w15 w16se w16cid w16 w16cex w16sdtdh w16sdtfl w16du wp14">
-  <w:p>
-    <w:pPr>
-      <w:pStyle w:val="Header"/>
-    </w:pPr>
-    <w:r>
-      <w:t xml:space="preserve">Updated </w:t>
-    </w:r>
-    <w:r>
-      <w:t>September</w:t>
-    </w:r>
-    <w:r>
-      <w:t xml:space="preserve"> </w:t>
-    </w:r>
-    <w:r>
-      <w:t>202</w:t>
-    </w:r>
-    <w:r>
-      <w:t>5</w:t>
-    </w:r>
-  </w:p>
-</w:hdr>
 </file>
 
 <file path=word/numbering.xml><?xml version="1.0" encoding="utf-8"?>
@@ -8759,7 +8750,8 @@
       <w:szCs w:val="48"/>
     </w:rPr>
   </w:style>
-  <w:style w:type="table" w:customStyle="1" w:styleId="a">
+  <w:style w:type="table" w:customStyle="1" w:styleId="1">
+    <w:name w:val="1"/>
     <w:basedOn w:val="TableNormal"/>
     <w:tblPr>
       <w:tblStyleRowBandSize w:val="1"/>
@@ -8988,7 +8980,7 @@
     <w:charset w:val="00"/>
     <w:family w:val="swiss"/>
     <w:pitch w:val="variable"/>
-    <w:sig w:usb0="E4002EFF" w:usb1="C000247B" w:usb2="00000009" w:usb3="00000000" w:csb0="000001FF" w:csb1="00000000"/>
+    <w:sig w:usb0="E4002EFF" w:usb1="C200247B" w:usb2="00000009" w:usb3="00000000" w:csb0="000001FF" w:csb1="00000000"/>
   </w:font>
   <w:font w:name="Courier New">
     <w:panose1 w:val="02070309020205020404"/>
@@ -9030,7 +9022,7 @@
     <w:charset w:val="00"/>
     <w:family w:val="swiss"/>
     <w:pitch w:val="variable"/>
-    <w:sig w:usb0="E4002EFF" w:usb1="C000247B" w:usb2="00000009" w:usb3="00000000" w:csb0="000001FF" w:csb1="00000000"/>
+    <w:sig w:usb0="E0002AFF" w:usb1="C000247B" w:usb2="00000009" w:usb3="00000000" w:csb0="000001FF" w:csb1="00000000"/>
   </w:font>
   <w:font w:name="Georgia">
     <w:panose1 w:val="02040502050405020303"/>
@@ -9040,7 +9032,6 @@
     <w:sig w:usb0="00000287" w:usb1="00000000" w:usb2="00000000" w:usb3="00000000" w:csb0="0000009F" w:csb1="00000000"/>
   </w:font>
   <w:font w:name="Open Sans">
-    <w:altName w:val="Open Sans"/>
     <w:panose1 w:val="020B0606030504020204"/>
     <w:charset w:val="00"/>
     <w:family w:val="swiss"/>
@@ -9084,9 +9075,14 @@
     <w:rsid w:val="001565F5"/>
     <w:rsid w:val="002031E8"/>
     <w:rsid w:val="00542AD4"/>
+    <w:rsid w:val="00595C1E"/>
+    <w:rsid w:val="00691BF7"/>
+    <w:rsid w:val="00B40536"/>
     <w:rsid w:val="00B51CAA"/>
     <w:rsid w:val="00D63D08"/>
+    <w:rsid w:val="00E30BD3"/>
     <w:rsid w:val="00E72AD0"/>
+    <w:rsid w:val="00FB3538"/>
   </w:rsids>
   <m:mathPr>
     <m:mathFont m:val="Cambria Math"/>

</xml_diff>